<commit_message>
updated the report document and readme section
</commit_message>
<xml_diff>
--- a/Evidence/QuickGridSorting.docx
+++ b/Evidence/QuickGridSorting.docx
@@ -58,7 +58,7 @@
         </w:rPr>
         <w:t xml:space="preserve">Issue: </w:t>
       </w:r>
-      <w:hyperlink r:id="rId9" w:history="1">
+      <w:hyperlink r:id="rId11" w:history="1">
         <w:r>
           <w:rPr>
             <w:rStyle w:val="Hyperlink"/>
@@ -86,7 +86,7 @@
         </w:rPr>
         <w:t xml:space="preserve">Sample repo: </w:t>
       </w:r>
-      <w:hyperlink r:id="rId10" w:history="1">
+      <w:hyperlink r:id="rId12" w:history="1">
         <w:r>
           <w:rPr>
             <w:rStyle w:val="Hyperlink"/>
@@ -350,7 +350,7 @@
           <w:sz w:val="22"/>
           <w:szCs w:val="22"/>
         </w:rPr>
-        <w:t>11.0.0-rc.1.26431.118</w:t>
+        <w:t>11.0.100-rc.1.26431.118</w:t>
       </w:r>
     </w:p>
     <w:p>
@@ -449,8 +449,742 @@
       <w:pPr>
         <w:rPr>
           <w:rFonts w:ascii="Segoe UI" w:hAnsi="Segoe UI" w:cs="Segoe UI"/>
-          <w:sz w:val="22"/>
-          <w:szCs w:val="22"/>
+          <w:b/>
+          <w:bCs/>
+          <w:sz w:val="26"/>
+          <w:szCs w:val="26"/>
+          <w:u w:val="single"/>
+        </w:rPr>
+      </w:pPr>
+      <w:r>
+        <w:rPr>
+          <w:rFonts w:ascii="Segoe UI" w:hAnsi="Segoe UI" w:cs="Segoe UI"/>
+          <w:b/>
+          <w:bCs/>
+          <w:sz w:val="26"/>
+          <w:szCs w:val="26"/>
+          <w:u w:val="single"/>
+        </w:rPr>
+        <w:t>Documentation Assessment</w:t>
+      </w:r>
+    </w:p>
+    <w:p>
+      <w:pPr>
+        <w:rPr>
+          <w:rFonts w:ascii="Segoe UI" w:hAnsi="Segoe UI" w:cs="Segoe UI"/>
+          <w:sz w:val="22"/>
+          <w:szCs w:val="22"/>
+        </w:rPr>
+      </w:pPr>
+      <w:r>
+        <w:rPr>
+          <w:rFonts w:ascii="Segoe UI" w:hAnsi="Segoe UI" w:cs="Segoe UI"/>
+          <w:sz w:val="22"/>
+          <w:szCs w:val="22"/>
+        </w:rPr>
+        <w:t>The .NET 11 QuickGrid documentation states that `sort` contains the</w:t>
+      </w:r>
+      <w:r>
+        <w:rPr>
+          <w:rFonts w:ascii="Segoe UI" w:hAnsi="Segoe UI" w:cs="Segoe UI"/>
+          <w:sz w:val="22"/>
+          <w:szCs w:val="22"/>
+        </w:rPr>
+        <w:t xml:space="preserve"> </w:t>
+      </w:r>
+      <w:r>
+        <w:rPr>
+          <w:rFonts w:ascii="Segoe UI" w:hAnsi="Segoe UI" w:cs="Segoe UI"/>
+          <w:sz w:val="22"/>
+          <w:szCs w:val="22"/>
+        </w:rPr>
+        <w:t xml:space="preserve">column's </w:t>
+      </w:r>
+      <w:r>
+        <w:rPr>
+          <w:rFonts w:ascii="Segoe UI" w:hAnsi="Segoe UI" w:cs="Segoe UI"/>
+          <w:color w:val="BF4E14" w:themeColor="accent2" w:themeShade="BF"/>
+          <w:sz w:val="22"/>
+          <w:szCs w:val="22"/>
+        </w:rPr>
+        <w:t>Title</w:t>
+      </w:r>
+      <w:r>
+        <w:rPr>
+          <w:rFonts w:ascii="Segoe UI" w:hAnsi="Segoe UI" w:cs="Segoe UI"/>
+          <w:sz w:val="22"/>
+          <w:szCs w:val="22"/>
+        </w:rPr>
+        <w:t xml:space="preserve">, while </w:t>
+      </w:r>
+      <w:r>
+        <w:rPr>
+          <w:rFonts w:ascii="Segoe UI" w:hAnsi="Segoe UI" w:cs="Segoe UI"/>
+          <w:color w:val="BF4E14" w:themeColor="accent2" w:themeShade="BF"/>
+          <w:sz w:val="22"/>
+          <w:szCs w:val="22"/>
+        </w:rPr>
+        <w:t>direction</w:t>
+      </w:r>
+      <w:r>
+        <w:rPr>
+          <w:rFonts w:ascii="Segoe UI" w:hAnsi="Segoe UI" w:cs="Segoe UI"/>
+          <w:sz w:val="22"/>
+          <w:szCs w:val="22"/>
+        </w:rPr>
+        <w:t xml:space="preserve"> accepts </w:t>
+      </w:r>
+      <w:r>
+        <w:rPr>
+          <w:rFonts w:ascii="Segoe UI" w:hAnsi="Segoe UI" w:cs="Segoe UI"/>
+          <w:color w:val="BF4E14" w:themeColor="accent2" w:themeShade="BF"/>
+          <w:sz w:val="22"/>
+          <w:szCs w:val="22"/>
+        </w:rPr>
+        <w:t xml:space="preserve">asc </w:t>
+      </w:r>
+      <w:r>
+        <w:rPr>
+          <w:rFonts w:ascii="Segoe UI" w:hAnsi="Segoe UI" w:cs="Segoe UI"/>
+          <w:sz w:val="22"/>
+          <w:szCs w:val="22"/>
+        </w:rPr>
+        <w:t xml:space="preserve">or </w:t>
+      </w:r>
+      <w:r>
+        <w:rPr>
+          <w:rFonts w:ascii="Segoe UI" w:hAnsi="Segoe UI" w:cs="Segoe UI"/>
+          <w:color w:val="BF4E14" w:themeColor="accent2" w:themeShade="BF"/>
+          <w:sz w:val="22"/>
+          <w:szCs w:val="22"/>
+        </w:rPr>
+        <w:t>desc</w:t>
+      </w:r>
+      <w:r>
+        <w:rPr>
+          <w:rFonts w:ascii="Segoe UI" w:hAnsi="Segoe UI" w:cs="Segoe UI"/>
+          <w:sz w:val="22"/>
+          <w:szCs w:val="22"/>
+        </w:rPr>
+        <w:t>.</w:t>
+      </w:r>
+    </w:p>
+    <w:p>
+      <w:pPr>
+        <w:rPr>
+          <w:rFonts w:ascii="Segoe UI" w:hAnsi="Segoe UI" w:cs="Segoe UI"/>
+          <w:sz w:val="22"/>
+          <w:szCs w:val="22"/>
+        </w:rPr>
+      </w:pPr>
+    </w:p>
+    <w:p>
+      <w:pPr>
+        <w:rPr>
+          <w:rFonts w:ascii="Segoe UI" w:hAnsi="Segoe UI" w:cs="Segoe UI"/>
+          <w:sz w:val="22"/>
+          <w:szCs w:val="22"/>
+        </w:rPr>
+      </w:pPr>
+      <w:r>
+        <w:rPr>
+          <w:rFonts w:ascii="Segoe UI" w:hAnsi="Segoe UI" w:cs="Segoe UI"/>
+          <w:sz w:val="22"/>
+          <w:szCs w:val="22"/>
+        </w:rPr>
+        <w:t>For this sample:</w:t>
+      </w:r>
+    </w:p>
+    <w:p>
+      <w:pPr>
+        <w:pStyle w:val="ListParagraph"/>
+        <w:numPr>
+          <w:ilvl w:val="0"/>
+          <w:numId w:val="16"/>
+        </w:numPr>
+        <w:rPr>
+          <w:rFonts w:ascii="Segoe UI" w:hAnsi="Segoe UI" w:cs="Segoe UI"/>
+          <w:sz w:val="22"/>
+          <w:szCs w:val="22"/>
+        </w:rPr>
+      </w:pPr>
+      <w:r>
+        <w:rPr>
+          <w:rFonts w:ascii="Segoe UI" w:hAnsi="Segoe UI" w:cs="Segoe UI"/>
+          <w:color w:val="BF4E14" w:themeColor="accent2" w:themeShade="BF"/>
+          <w:sz w:val="22"/>
+          <w:szCs w:val="22"/>
+        </w:rPr>
+        <w:t xml:space="preserve">sort=Name </w:t>
+      </w:r>
+      <w:r>
+        <w:rPr>
+          <w:rFonts w:ascii="Segoe UI" w:hAnsi="Segoe UI" w:cs="Segoe UI"/>
+          <w:sz w:val="22"/>
+          <w:szCs w:val="22"/>
+        </w:rPr>
+        <w:t xml:space="preserve">selects the column titled </w:t>
+      </w:r>
+      <w:r>
+        <w:rPr>
+          <w:rFonts w:ascii="Segoe UI" w:hAnsi="Segoe UI" w:cs="Segoe UI"/>
+          <w:color w:val="BF4E14" w:themeColor="accent2" w:themeShade="BF"/>
+          <w:sz w:val="22"/>
+          <w:szCs w:val="22"/>
+        </w:rPr>
+        <w:t>Name</w:t>
+      </w:r>
+      <w:r>
+        <w:rPr>
+          <w:rFonts w:ascii="Segoe UI" w:hAnsi="Segoe UI" w:cs="Segoe UI"/>
+          <w:sz w:val="22"/>
+          <w:szCs w:val="22"/>
+        </w:rPr>
+        <w:t>.</w:t>
+      </w:r>
+    </w:p>
+    <w:p>
+      <w:pPr>
+        <w:pStyle w:val="ListParagraph"/>
+        <w:numPr>
+          <w:ilvl w:val="0"/>
+          <w:numId w:val="16"/>
+        </w:numPr>
+        <w:rPr>
+          <w:rFonts w:ascii="Segoe UI" w:hAnsi="Segoe UI" w:cs="Segoe UI"/>
+          <w:sz w:val="22"/>
+          <w:szCs w:val="22"/>
+        </w:rPr>
+      </w:pPr>
+      <w:r>
+        <w:rPr>
+          <w:rFonts w:ascii="Segoe UI" w:hAnsi="Segoe UI" w:cs="Segoe UI"/>
+          <w:color w:val="BF4E14" w:themeColor="accent2" w:themeShade="BF"/>
+          <w:sz w:val="22"/>
+          <w:szCs w:val="22"/>
+        </w:rPr>
+        <w:t>s</w:t>
+      </w:r>
+      <w:r>
+        <w:rPr>
+          <w:rFonts w:ascii="Segoe UI" w:hAnsi="Segoe UI" w:cs="Segoe UI"/>
+          <w:color w:val="BF4E14" w:themeColor="accent2" w:themeShade="BF"/>
+          <w:sz w:val="22"/>
+          <w:szCs w:val="22"/>
+        </w:rPr>
+        <w:t>ort=Price</w:t>
+      </w:r>
+      <w:r>
+        <w:rPr>
+          <w:rFonts w:ascii="Segoe UI" w:hAnsi="Segoe UI" w:cs="Segoe UI"/>
+          <w:color w:val="BF4E14" w:themeColor="accent2" w:themeShade="BF"/>
+          <w:sz w:val="22"/>
+          <w:szCs w:val="22"/>
+        </w:rPr>
+        <w:t xml:space="preserve"> </w:t>
+      </w:r>
+      <w:r>
+        <w:rPr>
+          <w:rFonts w:ascii="Segoe UI" w:hAnsi="Segoe UI" w:cs="Segoe UI"/>
+          <w:sz w:val="22"/>
+          <w:szCs w:val="22"/>
+        </w:rPr>
+        <w:t xml:space="preserve">selects the column titled </w:t>
+      </w:r>
+      <w:r>
+        <w:rPr>
+          <w:rFonts w:ascii="Segoe UI" w:hAnsi="Segoe UI" w:cs="Segoe UI"/>
+          <w:color w:val="BF4E14" w:themeColor="accent2" w:themeShade="BF"/>
+          <w:sz w:val="22"/>
+          <w:szCs w:val="22"/>
+        </w:rPr>
+        <w:t>Pric</w:t>
+      </w:r>
+      <w:r>
+        <w:rPr>
+          <w:rFonts w:ascii="Segoe UI" w:hAnsi="Segoe UI" w:cs="Segoe UI"/>
+          <w:color w:val="BF4E14" w:themeColor="accent2" w:themeShade="BF"/>
+          <w:sz w:val="22"/>
+          <w:szCs w:val="22"/>
+        </w:rPr>
+        <w:t>e</w:t>
+      </w:r>
+      <w:r>
+        <w:rPr>
+          <w:rFonts w:ascii="Segoe UI" w:hAnsi="Segoe UI" w:cs="Segoe UI"/>
+          <w:sz w:val="22"/>
+          <w:szCs w:val="22"/>
+        </w:rPr>
+        <w:t>.</w:t>
+      </w:r>
+    </w:p>
+    <w:p>
+      <w:pPr>
+        <w:pStyle w:val="ListParagraph"/>
+        <w:numPr>
+          <w:ilvl w:val="0"/>
+          <w:numId w:val="16"/>
+        </w:numPr>
+        <w:rPr>
+          <w:rFonts w:ascii="Segoe UI" w:hAnsi="Segoe UI" w:cs="Segoe UI"/>
+          <w:sz w:val="22"/>
+          <w:szCs w:val="22"/>
+        </w:rPr>
+      </w:pPr>
+      <w:r>
+        <w:rPr>
+          <w:rFonts w:ascii="Segoe UI" w:hAnsi="Segoe UI" w:cs="Segoe UI"/>
+          <w:color w:val="BF4E14" w:themeColor="accent2" w:themeShade="BF"/>
+          <w:sz w:val="22"/>
+          <w:szCs w:val="22"/>
+        </w:rPr>
+        <w:t xml:space="preserve">direction=asc </w:t>
+      </w:r>
+      <w:r>
+        <w:rPr>
+          <w:rFonts w:ascii="Segoe UI" w:hAnsi="Segoe UI" w:cs="Segoe UI"/>
+          <w:sz w:val="22"/>
+          <w:szCs w:val="22"/>
+        </w:rPr>
+        <w:t xml:space="preserve">and </w:t>
+      </w:r>
+      <w:r>
+        <w:rPr>
+          <w:rFonts w:ascii="Segoe UI" w:hAnsi="Segoe UI" w:cs="Segoe UI"/>
+          <w:color w:val="BF4E14" w:themeColor="accent2" w:themeShade="BF"/>
+          <w:sz w:val="22"/>
+          <w:szCs w:val="22"/>
+        </w:rPr>
+        <w:t xml:space="preserve">direction=desc </w:t>
+      </w:r>
+      <w:r>
+        <w:rPr>
+          <w:rFonts w:ascii="Segoe UI" w:hAnsi="Segoe UI" w:cs="Segoe UI"/>
+          <w:sz w:val="22"/>
+          <w:szCs w:val="22"/>
+        </w:rPr>
+        <w:t>select</w:t>
+      </w:r>
+      <w:r>
+        <w:rPr>
+          <w:rFonts w:ascii="Segoe UI" w:hAnsi="Segoe UI" w:cs="Segoe UI"/>
+          <w:sz w:val="22"/>
+          <w:szCs w:val="22"/>
+        </w:rPr>
+        <w:t>s</w:t>
+      </w:r>
+      <w:r>
+        <w:rPr>
+          <w:rFonts w:ascii="Segoe UI" w:hAnsi="Segoe UI" w:cs="Segoe UI"/>
+          <w:sz w:val="22"/>
+          <w:szCs w:val="22"/>
+        </w:rPr>
+        <w:t xml:space="preserve"> the ordering.</w:t>
+      </w:r>
+    </w:p>
+    <w:p>
+      <w:pPr>
+        <w:pStyle w:val="ListParagraph"/>
+        <w:numPr>
+          <w:ilvl w:val="0"/>
+          <w:numId w:val="16"/>
+        </w:numPr>
+        <w:rPr>
+          <w:rFonts w:ascii="Segoe UI" w:hAnsi="Segoe UI" w:cs="Segoe UI"/>
+          <w:sz w:val="22"/>
+          <w:szCs w:val="22"/>
+        </w:rPr>
+      </w:pPr>
+      <w:r>
+        <w:rPr>
+          <w:rFonts w:ascii="Segoe UI" w:hAnsi="Segoe UI" w:cs="Segoe UI"/>
+          <w:sz w:val="22"/>
+          <w:szCs w:val="22"/>
+        </w:rPr>
+        <w:t>The PropertyColumn without an explicit Title infers ItemNumber,</w:t>
+      </w:r>
+      <w:r>
+        <w:rPr>
+          <w:rFonts w:ascii="Segoe UI" w:hAnsi="Segoe UI" w:cs="Segoe UI"/>
+          <w:sz w:val="22"/>
+          <w:szCs w:val="22"/>
+        </w:rPr>
+        <w:t xml:space="preserve"> </w:t>
+      </w:r>
+      <w:r>
+        <w:rPr>
+          <w:rFonts w:ascii="Segoe UI" w:hAnsi="Segoe UI" w:cs="Segoe UI"/>
+          <w:sz w:val="22"/>
+          <w:szCs w:val="22"/>
+        </w:rPr>
+        <w:t xml:space="preserve">which is also used as its </w:t>
+      </w:r>
+      <w:proofErr w:type="gramStart"/>
+      <w:r>
+        <w:rPr>
+          <w:rFonts w:ascii="Segoe UI" w:hAnsi="Segoe UI" w:cs="Segoe UI"/>
+          <w:sz w:val="22"/>
+          <w:szCs w:val="22"/>
+        </w:rPr>
+        <w:t>sort</w:t>
+      </w:r>
+      <w:proofErr w:type="gramEnd"/>
+      <w:r>
+        <w:rPr>
+          <w:rFonts w:ascii="Segoe UI" w:hAnsi="Segoe UI" w:cs="Segoe UI"/>
+          <w:sz w:val="22"/>
+          <w:szCs w:val="22"/>
+        </w:rPr>
+        <w:t xml:space="preserve"> value.</w:t>
+      </w:r>
+    </w:p>
+    <w:p>
+      <w:pPr>
+        <w:rPr>
+          <w:rFonts w:ascii="Segoe UI" w:hAnsi="Segoe UI" w:cs="Segoe UI"/>
+          <w:b/>
+          <w:bCs/>
+          <w:sz w:val="26"/>
+          <w:szCs w:val="26"/>
+          <w:u w:val="single"/>
+          <w:lang w:val="en-IN"/>
+        </w:rPr>
+      </w:pPr>
+      <w:r>
+        <w:rPr>
+          <w:rFonts w:ascii="Segoe UI" w:hAnsi="Segoe UI" w:cs="Segoe UI"/>
+          <w:b/>
+          <w:bCs/>
+          <w:sz w:val="26"/>
+          <w:szCs w:val="26"/>
+          <w:u w:val="single"/>
+          <w:lang w:val="en-IN"/>
+        </w:rPr>
+        <w:lastRenderedPageBreak/>
+        <w:t>Configuration Differences</w:t>
+      </w:r>
+    </w:p>
+    <w:p>
+      <w:pPr>
+        <w:pStyle w:val="ListParagraph"/>
+        <w:numPr>
+          <w:ilvl w:val="0"/>
+          <w:numId w:val="15"/>
+        </w:numPr>
+        <w:rPr>
+          <w:rFonts w:ascii="Segoe UI" w:hAnsi="Segoe UI" w:cs="Segoe UI"/>
+          <w:sz w:val="22"/>
+          <w:szCs w:val="22"/>
+          <w:lang w:val="en-IN"/>
+        </w:rPr>
+      </w:pPr>
+      <w:r>
+        <w:rPr>
+          <w:rFonts w:ascii="Segoe UI" w:hAnsi="Segoe UI" w:cs="Segoe UI"/>
+          <w:sz w:val="22"/>
+          <w:szCs w:val="22"/>
+          <w:lang w:val="en-IN"/>
+        </w:rPr>
+        <w:t>Static SSR sorting issued HTTP 200 server requests using enhanced navigation and replaced the server-rendered grid content.</w:t>
+      </w:r>
+    </w:p>
+    <w:p>
+      <w:pPr>
+        <w:pStyle w:val="ListParagraph"/>
+        <w:numPr>
+          <w:ilvl w:val="0"/>
+          <w:numId w:val="15"/>
+        </w:numPr>
+        <w:rPr>
+          <w:rFonts w:ascii="Segoe UI" w:hAnsi="Segoe UI" w:cs="Segoe UI"/>
+          <w:sz w:val="22"/>
+          <w:szCs w:val="22"/>
+          <w:lang w:val="en-IN"/>
+        </w:rPr>
+      </w:pPr>
+      <w:r>
+        <w:rPr>
+          <w:rFonts w:ascii="Segoe UI" w:hAnsi="Segoe UI" w:cs="Segoe UI"/>
+          <w:sz w:val="22"/>
+          <w:szCs w:val="22"/>
+          <w:lang w:val="en-IN"/>
+        </w:rPr>
+        <w:t>Interactive Server updated the URL and re-rendered the grid through its interactive circuit. Interactive WebAssembly updated the URL and re-rendered the grid in the browser.</w:t>
+      </w:r>
+    </w:p>
+    <w:p>
+      <w:pPr>
+        <w:pStyle w:val="ListParagraph"/>
+        <w:numPr>
+          <w:ilvl w:val="0"/>
+          <w:numId w:val="15"/>
+        </w:numPr>
+        <w:rPr>
+          <w:rFonts w:ascii="Segoe UI" w:hAnsi="Segoe UI" w:cs="Segoe UI"/>
+          <w:sz w:val="22"/>
+          <w:szCs w:val="22"/>
+          <w:lang w:val="en-IN"/>
+        </w:rPr>
+      </w:pPr>
+      <w:r>
+        <w:rPr>
+          <w:rFonts w:ascii="Segoe UI" w:hAnsi="Segoe UI" w:cs="Segoe UI"/>
+          <w:sz w:val="22"/>
+          <w:szCs w:val="22"/>
+          <w:lang w:val="en-IN"/>
+        </w:rPr>
+        <w:t>In all three configurations, the URL was sufficient to reproduce the same sort order in a fresh session.</w:t>
+      </w:r>
+    </w:p>
+    <w:p>
+      <w:pPr>
+        <w:ind w:left="360"/>
+        <w:rPr>
+          <w:rFonts w:ascii="Segoe UI" w:hAnsi="Segoe UI" w:cs="Segoe UI"/>
+          <w:sz w:val="22"/>
+          <w:szCs w:val="22"/>
+          <w:lang w:val="en-IN"/>
+        </w:rPr>
+      </w:pPr>
+    </w:p>
+    <w:p>
+      <w:pPr>
+        <w:rPr>
+          <w:rFonts w:ascii="Segoe UI" w:hAnsi="Segoe UI" w:cs="Segoe UI"/>
+          <w:sz w:val="22"/>
+          <w:szCs w:val="22"/>
+        </w:rPr>
+      </w:pPr>
+      <w:r>
+        <w:rPr>
+          <w:rFonts w:ascii="Segoe UI" w:hAnsi="Segoe UI" w:cs="Segoe UI"/>
+          <w:sz w:val="22"/>
+          <w:szCs w:val="22"/>
+        </w:rPr>
+        <w:t>----------------------------------------------------------------------------------------------------------</w:t>
+      </w:r>
+    </w:p>
+    <w:p>
+      <w:pPr>
+        <w:rPr>
+          <w:rFonts w:ascii="Segoe UI" w:hAnsi="Segoe UI" w:cs="Segoe UI"/>
+          <w:sz w:val="26"/>
+          <w:szCs w:val="26"/>
+          <w:u w:val="single"/>
+          <w:lang w:val="en-IN"/>
+        </w:rPr>
+      </w:pPr>
+      <w:r>
+        <w:rPr>
+          <w:rFonts w:ascii="Segoe UI" w:hAnsi="Segoe UI" w:cs="Segoe UI"/>
+          <w:b/>
+          <w:bCs/>
+          <w:sz w:val="26"/>
+          <w:szCs w:val="26"/>
+          <w:u w:val="single"/>
+          <w:lang w:val="en-IN"/>
+        </w:rPr>
+        <w:t>Problems</w:t>
+      </w:r>
+    </w:p>
+    <w:p>
+      <w:pPr>
+        <w:rPr>
+          <w:rFonts w:ascii="Segoe UI" w:hAnsi="Segoe UI" w:cs="Segoe UI"/>
+          <w:sz w:val="22"/>
+          <w:szCs w:val="22"/>
+          <w:lang w:val="en-IN"/>
+        </w:rPr>
+      </w:pPr>
+      <w:r>
+        <w:rPr>
+          <w:rFonts w:ascii="Segoe UI" w:hAnsi="Segoe UI" w:cs="Segoe UI"/>
+          <w:sz w:val="22"/>
+          <w:szCs w:val="22"/>
+          <w:lang w:val="en-IN"/>
+        </w:rPr>
+        <w:t>No product, diagnostic, documentation, accessibility, or scenario problems</w:t>
+      </w:r>
+      <w:r>
+        <w:rPr>
+          <w:rFonts w:ascii="Segoe UI" w:hAnsi="Segoe UI" w:cs="Segoe UI"/>
+          <w:sz w:val="22"/>
+          <w:szCs w:val="22"/>
+          <w:lang w:val="en-IN"/>
+        </w:rPr>
+        <w:t xml:space="preserve"> </w:t>
+      </w:r>
+      <w:r>
+        <w:rPr>
+          <w:rFonts w:ascii="Segoe UI" w:hAnsi="Segoe UI" w:cs="Segoe UI"/>
+          <w:sz w:val="22"/>
+          <w:szCs w:val="22"/>
+          <w:lang w:val="en-IN"/>
+        </w:rPr>
+        <w:t>were observed during the validation.</w:t>
+      </w:r>
+    </w:p>
+    <w:p>
+      <w:pPr>
+        <w:rPr>
+          <w:rFonts w:ascii="Segoe UI" w:hAnsi="Segoe UI" w:cs="Segoe UI"/>
+          <w:sz w:val="22"/>
+          <w:szCs w:val="22"/>
+        </w:rPr>
+      </w:pPr>
+    </w:p>
+    <w:p>
+      <w:pPr>
+        <w:rPr>
+          <w:rFonts w:ascii="Segoe UI" w:hAnsi="Segoe UI" w:cs="Segoe UI"/>
+          <w:sz w:val="22"/>
+          <w:szCs w:val="22"/>
+        </w:rPr>
+      </w:pPr>
+      <w:r>
+        <w:rPr>
+          <w:rFonts w:ascii="Segoe UI" w:hAnsi="Segoe UI" w:cs="Segoe UI"/>
+          <w:sz w:val="22"/>
+          <w:szCs w:val="22"/>
+        </w:rPr>
+        <w:t>----------------------------------------------------------------------------------------------------------</w:t>
+      </w:r>
+    </w:p>
+    <w:p>
+      <w:pPr>
+        <w:rPr>
+          <w:rFonts w:ascii="Segoe UI" w:hAnsi="Segoe UI" w:cs="Segoe UI"/>
+          <w:sz w:val="26"/>
+          <w:szCs w:val="26"/>
+          <w:u w:val="single"/>
+          <w:lang w:val="en-IN"/>
+        </w:rPr>
+      </w:pPr>
+      <w:r>
+        <w:rPr>
+          <w:rFonts w:ascii="Segoe UI" w:hAnsi="Segoe UI" w:cs="Segoe UI"/>
+          <w:b/>
+          <w:bCs/>
+          <w:sz w:val="26"/>
+          <w:szCs w:val="26"/>
+          <w:u w:val="single"/>
+          <w:lang w:val="en-IN"/>
+        </w:rPr>
+        <w:t>Not Covered</w:t>
+      </w:r>
+    </w:p>
+    <w:p>
+      <w:pPr>
+        <w:pStyle w:val="ListParagraph"/>
+        <w:numPr>
+          <w:ilvl w:val="0"/>
+          <w:numId w:val="14"/>
+        </w:numPr>
+        <w:rPr>
+          <w:rFonts w:ascii="Segoe UI" w:hAnsi="Segoe UI" w:cs="Segoe UI"/>
+          <w:sz w:val="22"/>
+          <w:szCs w:val="22"/>
+          <w:lang w:val="en-IN"/>
+        </w:rPr>
+      </w:pPr>
+      <w:r>
+        <w:rPr>
+          <w:rFonts w:ascii="Segoe UI" w:hAnsi="Segoe UI" w:cs="Segoe UI"/>
+          <w:sz w:val="22"/>
+          <w:szCs w:val="22"/>
+          <w:lang w:val="en-IN"/>
+        </w:rPr>
+        <w:t>No requested configurations or scenarios were intentionally omitted.</w:t>
+      </w:r>
+    </w:p>
+    <w:p>
+      <w:pPr>
+        <w:pStyle w:val="ListParagraph"/>
+        <w:numPr>
+          <w:ilvl w:val="0"/>
+          <w:numId w:val="14"/>
+        </w:numPr>
+        <w:rPr>
+          <w:rFonts w:ascii="Segoe UI" w:hAnsi="Segoe UI" w:cs="Segoe UI"/>
+          <w:sz w:val="22"/>
+          <w:szCs w:val="22"/>
+          <w:lang w:val="en-IN"/>
+        </w:rPr>
+      </w:pPr>
+      <w:r>
+        <w:rPr>
+          <w:rFonts w:ascii="Segoe UI" w:hAnsi="Segoe UI" w:cs="Segoe UI"/>
+          <w:sz w:val="22"/>
+          <w:szCs w:val="22"/>
+          <w:lang w:val="en-IN"/>
+        </w:rPr>
+        <w:t>Interactive Auto, Standalone WebAssembly, MAUI/Hybrid, AOT, trimming, containers, proxies, IDE as well as the command line and published output were outside this scenario.</w:t>
+      </w:r>
+    </w:p>
+    <w:p>
+      <w:pPr>
+        <w:pStyle w:val="ListParagraph"/>
+        <w:rPr>
+          <w:rFonts w:ascii="Segoe UI" w:hAnsi="Segoe UI" w:cs="Segoe UI"/>
+          <w:sz w:val="22"/>
+          <w:szCs w:val="22"/>
+          <w:lang w:val="en-IN"/>
+        </w:rPr>
+      </w:pPr>
+    </w:p>
+    <w:p>
+      <w:pPr>
+        <w:rPr>
+          <w:rFonts w:ascii="Segoe UI" w:hAnsi="Segoe UI" w:cs="Segoe UI"/>
+          <w:sz w:val="22"/>
+          <w:szCs w:val="22"/>
+          <w:lang w:val="en-IN"/>
+        </w:rPr>
+      </w:pPr>
+      <w:r>
+        <w:rPr>
+          <w:rFonts w:ascii="Segoe UI" w:hAnsi="Segoe UI" w:cs="Segoe UI"/>
+          <w:sz w:val="22"/>
+          <w:szCs w:val="22"/>
+        </w:rPr>
+        <w:t>----------------------------------------------------------------------------------------------------------</w:t>
+      </w:r>
+    </w:p>
+    <w:p>
+      <w:pPr>
+        <w:rPr>
+          <w:rFonts w:ascii="Segoe UI" w:hAnsi="Segoe UI" w:cs="Segoe UI"/>
+          <w:b/>
+          <w:bCs/>
+          <w:sz w:val="26"/>
+          <w:szCs w:val="26"/>
+          <w:u w:val="single"/>
+          <w:lang w:val="en-IN"/>
+        </w:rPr>
+      </w:pPr>
+      <w:r>
+        <w:rPr>
+          <w:rFonts w:ascii="Segoe UI" w:hAnsi="Segoe UI" w:cs="Segoe UI"/>
+          <w:b/>
+          <w:bCs/>
+          <w:sz w:val="26"/>
+          <w:szCs w:val="26"/>
+          <w:u w:val="single"/>
+          <w:lang w:val="en-IN"/>
+        </w:rPr>
+        <w:t>Scenarios Covered</w:t>
+      </w:r>
+    </w:p>
+    <w:p>
+      <w:pPr>
+        <w:rPr>
+          <w:rFonts w:ascii="Segoe UI" w:hAnsi="Segoe UI" w:cs="Segoe UI"/>
+          <w:b/>
+          <w:bCs/>
+          <w:sz w:val="26"/>
+          <w:szCs w:val="26"/>
+          <w:u w:val="single"/>
+          <w:lang w:val="en-IN"/>
         </w:rPr>
       </w:pPr>
     </w:p>
@@ -464,9 +1198,9 @@
       </w:tblPr>
       <w:tblGrid>
         <w:gridCol w:w="720"/>
-        <w:gridCol w:w="3960"/>
-        <w:gridCol w:w="1260"/>
-        <w:gridCol w:w="3960"/>
+        <w:gridCol w:w="4950"/>
+        <w:gridCol w:w="1080"/>
+        <w:gridCol w:w="3150"/>
       </w:tblGrid>
       <w:tr>
         <w:trPr>
@@ -488,6 +1222,7 @@
                 <w:szCs w:val="22"/>
               </w:rPr>
             </w:pPr>
+            <w:proofErr w:type="gramStart"/>
             <w:r>
               <w:rPr>
                 <w:rFonts w:ascii="Segoe UI" w:hAnsi="Segoe UI" w:cs="Segoe UI"/>
@@ -496,11 +1231,12 @@
               </w:rPr>
               <w:t>S.No</w:t>
             </w:r>
+            <w:proofErr w:type="gramEnd"/>
           </w:p>
         </w:tc>
         <w:tc>
           <w:tcPr>
-            <w:tcW w:w="3960" w:type="dxa"/>
+            <w:tcW w:w="4950" w:type="dxa"/>
             <w:hideMark/>
           </w:tcPr>
           <w:p>
@@ -528,7 +1264,7 @@
         </w:tc>
         <w:tc>
           <w:tcPr>
-            <w:tcW w:w="1260" w:type="dxa"/>
+            <w:tcW w:w="1080" w:type="dxa"/>
           </w:tcPr>
           <w:p>
             <w:pPr>
@@ -552,7 +1288,7 @@
         </w:tc>
         <w:tc>
           <w:tcPr>
-            <w:tcW w:w="3960" w:type="dxa"/>
+            <w:tcW w:w="3150" w:type="dxa"/>
           </w:tcPr>
           <w:p>
             <w:pPr>
@@ -607,7 +1343,7 @@
         </w:tc>
         <w:tc>
           <w:tcPr>
-            <w:tcW w:w="3960" w:type="dxa"/>
+            <w:tcW w:w="4950" w:type="dxa"/>
           </w:tcPr>
           <w:p>
             <w:pPr>
@@ -650,7 +1386,7 @@
         </w:tc>
         <w:tc>
           <w:tcPr>
-            <w:tcW w:w="1260" w:type="dxa"/>
+            <w:tcW w:w="1080" w:type="dxa"/>
           </w:tcPr>
           <w:p>
             <w:pPr>
@@ -672,7 +1408,7 @@
         </w:tc>
         <w:tc>
           <w:tcPr>
-            <w:tcW w:w="3960" w:type="dxa"/>
+            <w:tcW w:w="3150" w:type="dxa"/>
           </w:tcPr>
           <w:p>
             <w:pPr>
@@ -682,7 +1418,7 @@
                 <w:szCs w:val="22"/>
               </w:rPr>
             </w:pPr>
-            <w:hyperlink r:id="rId11" w:history="1">
+            <w:hyperlink r:id="rId13" w:history="1">
               <w:r>
                 <w:rPr>
                   <w:rStyle w:val="Hyperlink"/>
@@ -701,7 +1437,7 @@
                 <w:szCs w:val="22"/>
               </w:rPr>
             </w:pPr>
-            <w:hyperlink r:id="rId12" w:history="1">
+            <w:hyperlink r:id="rId14" w:history="1">
               <w:r>
                 <w:rPr>
                   <w:rStyle w:val="Hyperlink"/>
@@ -720,7 +1456,7 @@
                 <w:szCs w:val="22"/>
               </w:rPr>
             </w:pPr>
-            <w:hyperlink r:id="rId13" w:history="1">
+            <w:hyperlink r:id="rId15" w:history="1">
               <w:r>
                 <w:rPr>
                   <w:rStyle w:val="Hyperlink"/>
@@ -764,13 +1500,14 @@
                 <w:sz w:val="22"/>
                 <w:szCs w:val="22"/>
               </w:rPr>
+              <w:lastRenderedPageBreak/>
               <w:t>2</w:t>
             </w:r>
           </w:p>
         </w:tc>
         <w:tc>
           <w:tcPr>
-            <w:tcW w:w="3960" w:type="dxa"/>
+            <w:tcW w:w="4950" w:type="dxa"/>
           </w:tcPr>
           <w:p>
             <w:pPr>
@@ -783,6 +1520,23 @@
                 <w:lang w:val="en-IN"/>
               </w:rPr>
             </w:pPr>
+            <w:r>
+              <w:rPr>
+                <w:rFonts w:ascii="Segoe UI" w:hAnsi="Segoe UI" w:cs="Segoe UI"/>
+                <w:sz w:val="22"/>
+                <w:szCs w:val="22"/>
+                <w:highlight w:val="yellow"/>
+              </w:rPr>
+              <w:t>Must Hold Scenario</w:t>
+            </w:r>
+            <w:r>
+              <w:rPr>
+                <w:rFonts w:ascii="Segoe UI" w:hAnsi="Segoe UI" w:cs="Segoe UI"/>
+                <w:sz w:val="22"/>
+                <w:szCs w:val="22"/>
+              </w:rPr>
+              <w:t xml:space="preserve"> - </w:t>
+            </w:r>
             <w:r>
               <w:rPr>
                 <w:rFonts w:ascii="Segoe UI" w:hAnsi="Segoe UI" w:cs="Segoe UI"/>
@@ -813,7 +1567,7 @@
         </w:tc>
         <w:tc>
           <w:tcPr>
-            <w:tcW w:w="1260" w:type="dxa"/>
+            <w:tcW w:w="1080" w:type="dxa"/>
           </w:tcPr>
           <w:p>
             <w:pPr>
@@ -835,7 +1589,7 @@
         </w:tc>
         <w:tc>
           <w:tcPr>
-            <w:tcW w:w="3960" w:type="dxa"/>
+            <w:tcW w:w="3150" w:type="dxa"/>
           </w:tcPr>
           <w:p>
             <w:pPr>
@@ -845,7 +1599,7 @@
                 <w:szCs w:val="22"/>
               </w:rPr>
             </w:pPr>
-            <w:hyperlink r:id="rId14" w:history="1">
+            <w:hyperlink r:id="rId16" w:history="1">
               <w:r>
                 <w:rPr>
                   <w:rStyle w:val="Hyperlink"/>
@@ -864,7 +1618,7 @@
                 <w:szCs w:val="22"/>
               </w:rPr>
             </w:pPr>
-            <w:hyperlink r:id="rId15" w:history="1">
+            <w:hyperlink r:id="rId17" w:history="1">
               <w:r>
                 <w:rPr>
                   <w:rStyle w:val="Hyperlink"/>
@@ -883,7 +1637,7 @@
                 <w:szCs w:val="22"/>
               </w:rPr>
             </w:pPr>
-            <w:hyperlink r:id="rId16" w:history="1">
+            <w:hyperlink r:id="rId18" w:history="1">
               <w:r>
                 <w:rPr>
                   <w:rStyle w:val="Hyperlink"/>
@@ -936,7 +1690,7 @@
         </w:tc>
         <w:tc>
           <w:tcPr>
-            <w:tcW w:w="3960" w:type="dxa"/>
+            <w:tcW w:w="4950" w:type="dxa"/>
           </w:tcPr>
           <w:p>
             <w:pPr>
@@ -945,6 +1699,23 @@
                 <w:lang w:val="en-IN"/>
               </w:rPr>
             </w:pPr>
+            <w:r>
+              <w:rPr>
+                <w:rFonts w:ascii="Segoe UI" w:hAnsi="Segoe UI" w:cs="Segoe UI"/>
+                <w:sz w:val="22"/>
+                <w:szCs w:val="22"/>
+                <w:highlight w:val="yellow"/>
+              </w:rPr>
+              <w:t>Must Hold Scenario</w:t>
+            </w:r>
+            <w:r>
+              <w:rPr>
+                <w:rFonts w:ascii="Segoe UI" w:hAnsi="Segoe UI" w:cs="Segoe UI"/>
+                <w:sz w:val="22"/>
+                <w:szCs w:val="22"/>
+              </w:rPr>
+              <w:t xml:space="preserve"> - </w:t>
+            </w:r>
             <w:r>
               <w:t>Repeated </w:t>
             </w:r>
@@ -962,7 +1733,7 @@
         </w:tc>
         <w:tc>
           <w:tcPr>
-            <w:tcW w:w="1260" w:type="dxa"/>
+            <w:tcW w:w="1080" w:type="dxa"/>
           </w:tcPr>
           <w:p>
             <w:pPr>
@@ -984,7 +1755,7 @@
         </w:tc>
         <w:tc>
           <w:tcPr>
-            <w:tcW w:w="3960" w:type="dxa"/>
+            <w:tcW w:w="3150" w:type="dxa"/>
           </w:tcPr>
           <w:p>
             <w:pPr>
@@ -994,7 +1765,7 @@
                 <w:szCs w:val="22"/>
               </w:rPr>
             </w:pPr>
-            <w:hyperlink r:id="rId17" w:history="1">
+            <w:hyperlink r:id="rId19" w:history="1">
               <w:r>
                 <w:rPr>
                   <w:rStyle w:val="Hyperlink"/>
@@ -1013,7 +1784,7 @@
                 <w:szCs w:val="22"/>
               </w:rPr>
             </w:pPr>
-            <w:hyperlink r:id="rId18" w:history="1">
+            <w:hyperlink r:id="rId20" w:history="1">
               <w:r>
                 <w:rPr>
                   <w:rStyle w:val="Hyperlink"/>
@@ -1032,7 +1803,7 @@
                 <w:szCs w:val="22"/>
               </w:rPr>
             </w:pPr>
-            <w:hyperlink r:id="rId19" w:history="1">
+            <w:hyperlink r:id="rId21" w:history="1">
               <w:r>
                 <w:rPr>
                   <w:rStyle w:val="Hyperlink"/>
@@ -1076,14 +1847,13 @@
                 <w:sz w:val="22"/>
                 <w:szCs w:val="22"/>
               </w:rPr>
-              <w:lastRenderedPageBreak/>
               <w:t>4</w:t>
             </w:r>
           </w:p>
         </w:tc>
         <w:tc>
           <w:tcPr>
-            <w:tcW w:w="3960" w:type="dxa"/>
+            <w:tcW w:w="4950" w:type="dxa"/>
           </w:tcPr>
           <w:p>
             <w:pPr>
@@ -1136,7 +1906,7 @@
         </w:tc>
         <w:tc>
           <w:tcPr>
-            <w:tcW w:w="1260" w:type="dxa"/>
+            <w:tcW w:w="1080" w:type="dxa"/>
           </w:tcPr>
           <w:p>
             <w:pPr>
@@ -1158,7 +1928,7 @@
         </w:tc>
         <w:tc>
           <w:tcPr>
-            <w:tcW w:w="3960" w:type="dxa"/>
+            <w:tcW w:w="3150" w:type="dxa"/>
           </w:tcPr>
           <w:p>
             <w:pPr>
@@ -1168,7 +1938,7 @@
                 <w:szCs w:val="22"/>
               </w:rPr>
             </w:pPr>
-            <w:hyperlink r:id="rId20" w:history="1">
+            <w:hyperlink r:id="rId22" w:history="1">
               <w:r>
                 <w:rPr>
                   <w:rStyle w:val="Hyperlink"/>
@@ -1187,7 +1957,7 @@
                 <w:szCs w:val="22"/>
               </w:rPr>
             </w:pPr>
-            <w:hyperlink r:id="rId21" w:history="1">
+            <w:hyperlink r:id="rId23" w:history="1">
               <w:r>
                 <w:rPr>
                   <w:rStyle w:val="Hyperlink"/>
@@ -1206,7 +1976,7 @@
                 <w:szCs w:val="22"/>
               </w:rPr>
             </w:pPr>
-            <w:hyperlink r:id="rId22" w:history="1">
+            <w:hyperlink r:id="rId24" w:history="1">
               <w:r>
                 <w:rPr>
                   <w:rStyle w:val="Hyperlink"/>
@@ -1258,7 +2028,7 @@
         </w:tc>
         <w:tc>
           <w:tcPr>
-            <w:tcW w:w="3960" w:type="dxa"/>
+            <w:tcW w:w="4950" w:type="dxa"/>
           </w:tcPr>
           <w:p>
             <w:pPr>
@@ -1269,6 +2039,23 @@
                 <w:szCs w:val="22"/>
               </w:rPr>
             </w:pPr>
+            <w:r>
+              <w:rPr>
+                <w:rFonts w:ascii="Segoe UI" w:hAnsi="Segoe UI" w:cs="Segoe UI"/>
+                <w:sz w:val="22"/>
+                <w:szCs w:val="22"/>
+                <w:highlight w:val="yellow"/>
+              </w:rPr>
+              <w:t>Must Hold Scenario</w:t>
+            </w:r>
+            <w:r>
+              <w:rPr>
+                <w:rFonts w:ascii="Segoe UI" w:hAnsi="Segoe UI" w:cs="Segoe UI"/>
+                <w:sz w:val="22"/>
+                <w:szCs w:val="22"/>
+              </w:rPr>
+              <w:t xml:space="preserve"> - </w:t>
+            </w:r>
             <w:r>
               <w:rPr>
                 <w:rFonts w:ascii="Segoe UI" w:hAnsi="Segoe UI" w:cs="Segoe UI"/>
@@ -1292,7 +2079,7 @@
         </w:tc>
         <w:tc>
           <w:tcPr>
-            <w:tcW w:w="1260" w:type="dxa"/>
+            <w:tcW w:w="1080" w:type="dxa"/>
           </w:tcPr>
           <w:p>
             <w:pPr>
@@ -1314,7 +2101,7 @@
         </w:tc>
         <w:tc>
           <w:tcPr>
-            <w:tcW w:w="3960" w:type="dxa"/>
+            <w:tcW w:w="3150" w:type="dxa"/>
           </w:tcPr>
           <w:p>
             <w:pPr>
@@ -1324,14 +2111,30 @@
                 <w:szCs w:val="22"/>
               </w:rPr>
             </w:pPr>
-            <w:hyperlink r:id="rId23" w:history="1">
+            <w:hyperlink r:id="rId25" w:history="1">
               <w:r>
                 <w:rPr>
                   <w:rStyle w:val="Hyperlink"/>
                   <w:sz w:val="22"/>
                   <w:szCs w:val="22"/>
                 </w:rPr>
-                <w:t>5_Static.png</w:t>
+                <w:t>5_Static.</w:t>
+              </w:r>
+              <w:r>
+                <w:rPr>
+                  <w:rStyle w:val="Hyperlink"/>
+                  <w:sz w:val="22"/>
+                  <w:szCs w:val="22"/>
+                </w:rPr>
+                <w:t>p</w:t>
+              </w:r>
+              <w:r>
+                <w:rPr>
+                  <w:rStyle w:val="Hyperlink"/>
+                  <w:sz w:val="22"/>
+                  <w:szCs w:val="22"/>
+                </w:rPr>
+                <w:t>ng</w:t>
               </w:r>
             </w:hyperlink>
           </w:p>
@@ -1364,7 +2167,7 @@
         </w:tc>
         <w:tc>
           <w:tcPr>
-            <w:tcW w:w="3960" w:type="dxa"/>
+            <w:tcW w:w="4950" w:type="dxa"/>
           </w:tcPr>
           <w:p>
             <w:pPr>
@@ -1397,7 +2200,7 @@
         </w:tc>
         <w:tc>
           <w:tcPr>
-            <w:tcW w:w="1260" w:type="dxa"/>
+            <w:tcW w:w="1080" w:type="dxa"/>
           </w:tcPr>
           <w:p>
             <w:pPr>
@@ -1419,7 +2222,7 @@
         </w:tc>
         <w:tc>
           <w:tcPr>
-            <w:tcW w:w="3960" w:type="dxa"/>
+            <w:tcW w:w="3150" w:type="dxa"/>
           </w:tcPr>
           <w:p>
             <w:pPr>
@@ -1429,7 +2232,7 @@
                 <w:szCs w:val="22"/>
               </w:rPr>
             </w:pPr>
-            <w:hyperlink r:id="rId24" w:history="1">
+            <w:hyperlink r:id="rId26" w:history="1">
               <w:r>
                 <w:rPr>
                   <w:rStyle w:val="Hyperlink"/>
@@ -1473,7 +2276,7 @@
         </w:tc>
         <w:tc>
           <w:tcPr>
-            <w:tcW w:w="3960" w:type="dxa"/>
+            <w:tcW w:w="4950" w:type="dxa"/>
           </w:tcPr>
           <w:p>
             <w:pPr>
@@ -1485,6 +2288,23 @@
                 <w:lang w:val="en-IN"/>
               </w:rPr>
             </w:pPr>
+            <w:r>
+              <w:rPr>
+                <w:rFonts w:ascii="Segoe UI" w:hAnsi="Segoe UI" w:cs="Segoe UI"/>
+                <w:sz w:val="22"/>
+                <w:szCs w:val="22"/>
+                <w:highlight w:val="yellow"/>
+              </w:rPr>
+              <w:t>Must Hold Scenario</w:t>
+            </w:r>
+            <w:r>
+              <w:rPr>
+                <w:rFonts w:ascii="Segoe UI" w:hAnsi="Segoe UI" w:cs="Segoe UI"/>
+                <w:sz w:val="22"/>
+                <w:szCs w:val="22"/>
+              </w:rPr>
+              <w:t xml:space="preserve"> - </w:t>
+            </w:r>
             <w:r>
               <w:rPr>
                 <w:rFonts w:ascii="Segoe UI" w:hAnsi="Segoe UI" w:cs="Segoe UI"/>
@@ -1497,7 +2317,7 @@
         </w:tc>
         <w:tc>
           <w:tcPr>
-            <w:tcW w:w="1260" w:type="dxa"/>
+            <w:tcW w:w="1080" w:type="dxa"/>
           </w:tcPr>
           <w:p>
             <w:pPr>
@@ -1519,7 +2339,7 @@
         </w:tc>
         <w:tc>
           <w:tcPr>
-            <w:tcW w:w="3960" w:type="dxa"/>
+            <w:tcW w:w="3150" w:type="dxa"/>
           </w:tcPr>
           <w:p>
             <w:pPr>
@@ -1529,7 +2349,7 @@
                 <w:szCs w:val="22"/>
               </w:rPr>
             </w:pPr>
-            <w:hyperlink r:id="rId25" w:history="1">
+            <w:hyperlink r:id="rId27" w:history="1">
               <w:r>
                 <w:rPr>
                   <w:rStyle w:val="Hyperlink"/>
@@ -1548,7 +2368,7 @@
                 <w:szCs w:val="22"/>
               </w:rPr>
             </w:pPr>
-            <w:hyperlink r:id="rId26" w:history="1">
+            <w:hyperlink r:id="rId28" w:history="1">
               <w:r>
                 <w:rPr>
                   <w:rStyle w:val="Hyperlink"/>
@@ -1567,7 +2387,7 @@
                 <w:szCs w:val="22"/>
               </w:rPr>
             </w:pPr>
-            <w:hyperlink r:id="rId27" w:history="1">
+            <w:hyperlink r:id="rId29" w:history="1">
               <w:r>
                 <w:rPr>
                   <w:rStyle w:val="Hyperlink"/>
@@ -1586,7 +2406,7 @@
                 <w:szCs w:val="22"/>
               </w:rPr>
             </w:pPr>
-            <w:hyperlink r:id="rId28" w:history="1">
+            <w:hyperlink r:id="rId30" w:history="1">
               <w:r>
                 <w:rPr>
                   <w:rStyle w:val="Hyperlink"/>
@@ -1605,7 +2425,7 @@
                 <w:szCs w:val="22"/>
               </w:rPr>
             </w:pPr>
-            <w:hyperlink r:id="rId29" w:history="1">
+            <w:hyperlink r:id="rId31" w:history="1">
               <w:r>
                 <w:rPr>
                   <w:rStyle w:val="Hyperlink"/>
@@ -1624,7 +2444,7 @@
                 <w:szCs w:val="22"/>
               </w:rPr>
             </w:pPr>
-            <w:hyperlink r:id="rId30" w:history="1">
+            <w:hyperlink r:id="rId32" w:history="1">
               <w:r>
                 <w:rPr>
                   <w:rStyle w:val="Hyperlink"/>
@@ -1674,7 +2494,7 @@
         </w:tc>
         <w:tc>
           <w:tcPr>
-            <w:tcW w:w="3960" w:type="dxa"/>
+            <w:tcW w:w="4950" w:type="dxa"/>
           </w:tcPr>
           <w:p>
             <w:pPr>
@@ -1699,7 +2519,7 @@
         </w:tc>
         <w:tc>
           <w:tcPr>
-            <w:tcW w:w="1260" w:type="dxa"/>
+            <w:tcW w:w="1080" w:type="dxa"/>
           </w:tcPr>
           <w:p>
             <w:pPr>
@@ -1721,7 +2541,7 @@
         </w:tc>
         <w:tc>
           <w:tcPr>
-            <w:tcW w:w="3960" w:type="dxa"/>
+            <w:tcW w:w="3150" w:type="dxa"/>
           </w:tcPr>
           <w:p>
             <w:pPr>
@@ -1731,7 +2551,7 @@
                 <w:szCs w:val="22"/>
               </w:rPr>
             </w:pPr>
-            <w:hyperlink r:id="rId31" w:history="1">
+            <w:hyperlink r:id="rId33" w:history="1">
               <w:r>
                 <w:rPr>
                   <w:rStyle w:val="Hyperlink"/>
@@ -1750,7 +2570,7 @@
                 <w:szCs w:val="22"/>
               </w:rPr>
             </w:pPr>
-            <w:hyperlink r:id="rId32" w:history="1">
+            <w:hyperlink r:id="rId34" w:history="1">
               <w:r>
                 <w:rPr>
                   <w:rStyle w:val="Hyperlink"/>
@@ -1769,7 +2589,7 @@
                 <w:szCs w:val="22"/>
               </w:rPr>
             </w:pPr>
-            <w:hyperlink r:id="rId33" w:history="1">
+            <w:hyperlink r:id="rId35" w:history="1">
               <w:r>
                 <w:rPr>
                   <w:rStyle w:val="Hyperlink"/>
@@ -1821,7 +2641,7 @@
         </w:tc>
         <w:tc>
           <w:tcPr>
-            <w:tcW w:w="3960" w:type="dxa"/>
+            <w:tcW w:w="4950" w:type="dxa"/>
           </w:tcPr>
           <w:p>
             <w:pPr>
@@ -1855,7 +2675,7 @@
         </w:tc>
         <w:tc>
           <w:tcPr>
-            <w:tcW w:w="1260" w:type="dxa"/>
+            <w:tcW w:w="1080" w:type="dxa"/>
           </w:tcPr>
           <w:p>
             <w:pPr>
@@ -1878,7 +2698,7 @@
         </w:tc>
         <w:tc>
           <w:tcPr>
-            <w:tcW w:w="3960" w:type="dxa"/>
+            <w:tcW w:w="3150" w:type="dxa"/>
           </w:tcPr>
           <w:p>
             <w:pPr>
@@ -1889,7 +2709,7 @@
                 <w:lang w:val="fr-FR"/>
               </w:rPr>
             </w:pPr>
-            <w:hyperlink r:id="rId34" w:history="1">
+            <w:hyperlink r:id="rId36" w:history="1">
               <w:r>
                 <w:rPr>
                   <w:rStyle w:val="Hyperlink"/>
@@ -1910,7 +2730,7 @@
                 <w:lang w:val="fr-FR"/>
               </w:rPr>
             </w:pPr>
-            <w:hyperlink r:id="rId35" w:history="1">
+            <w:hyperlink r:id="rId37" w:history="1">
               <w:r>
                 <w:rPr>
                   <w:rStyle w:val="Hyperlink"/>
@@ -1931,7 +2751,7 @@
                 <w:lang w:val="fr-FR"/>
               </w:rPr>
             </w:pPr>
-            <w:hyperlink r:id="rId36" w:history="1">
+            <w:hyperlink r:id="rId38" w:history="1">
               <w:r>
                 <w:rPr>
                   <w:rStyle w:val="Hyperlink"/>
@@ -1943,16 +2763,6 @@
               </w:r>
             </w:hyperlink>
           </w:p>
-          <w:p>
-            <w:pPr>
-              <w:cnfStyle w:val="000000100000" w:firstRow="0" w:lastRow="0" w:firstColumn="0" w:lastColumn="0" w:oddVBand="0" w:evenVBand="0" w:oddHBand="1" w:evenHBand="0" w:firstRowFirstColumn="0" w:firstRowLastColumn="0" w:lastRowFirstColumn="0" w:lastRowLastColumn="0"/>
-              <w:rPr>
-                <w:sz w:val="22"/>
-                <w:szCs w:val="22"/>
-                <w:lang w:val="fr-FR"/>
-              </w:rPr>
-            </w:pPr>
-          </w:p>
         </w:tc>
       </w:tr>
       <w:tr>
@@ -1982,7 +2792,7 @@
         </w:tc>
         <w:tc>
           <w:tcPr>
-            <w:tcW w:w="3960" w:type="dxa"/>
+            <w:tcW w:w="4950" w:type="dxa"/>
           </w:tcPr>
           <w:p>
             <w:pPr>
@@ -1993,6 +2803,23 @@
                 <w:szCs w:val="22"/>
               </w:rPr>
             </w:pPr>
+            <w:r>
+              <w:rPr>
+                <w:rFonts w:ascii="Segoe UI" w:hAnsi="Segoe UI" w:cs="Segoe UI"/>
+                <w:sz w:val="22"/>
+                <w:szCs w:val="22"/>
+                <w:highlight w:val="yellow"/>
+              </w:rPr>
+              <w:t>Must Hold Scenario</w:t>
+            </w:r>
+            <w:r>
+              <w:rPr>
+                <w:rFonts w:ascii="Segoe UI" w:hAnsi="Segoe UI" w:cs="Segoe UI"/>
+                <w:sz w:val="22"/>
+                <w:szCs w:val="22"/>
+              </w:rPr>
+              <w:t xml:space="preserve"> - </w:t>
+            </w:r>
             <w:r>
               <w:rPr>
                 <w:rFonts w:ascii="Segoe UI" w:hAnsi="Segoe UI" w:cs="Segoe UI"/>
@@ -2016,7 +2843,7 @@
         </w:tc>
         <w:tc>
           <w:tcPr>
-            <w:tcW w:w="1260" w:type="dxa"/>
+            <w:tcW w:w="1080" w:type="dxa"/>
           </w:tcPr>
           <w:p>
             <w:pPr>
@@ -2038,7 +2865,7 @@
         </w:tc>
         <w:tc>
           <w:tcPr>
-            <w:tcW w:w="3960" w:type="dxa"/>
+            <w:tcW w:w="3150" w:type="dxa"/>
           </w:tcPr>
           <w:p>
             <w:pPr>
@@ -2048,7 +2875,7 @@
                 <w:szCs w:val="22"/>
               </w:rPr>
             </w:pPr>
-            <w:hyperlink r:id="rId37" w:history="1">
+            <w:hyperlink r:id="rId39" w:history="1">
               <w:r>
                 <w:rPr>
                   <w:rStyle w:val="Hyperlink"/>
@@ -2091,7 +2918,7 @@
         </w:tc>
         <w:tc>
           <w:tcPr>
-            <w:tcW w:w="3960" w:type="dxa"/>
+            <w:tcW w:w="4950" w:type="dxa"/>
           </w:tcPr>
           <w:p>
             <w:pPr>
@@ -2125,7 +2952,7 @@
         </w:tc>
         <w:tc>
           <w:tcPr>
-            <w:tcW w:w="1260" w:type="dxa"/>
+            <w:tcW w:w="1080" w:type="dxa"/>
           </w:tcPr>
           <w:p>
             <w:pPr>
@@ -2147,7 +2974,7 @@
         </w:tc>
         <w:tc>
           <w:tcPr>
-            <w:tcW w:w="3960" w:type="dxa"/>
+            <w:tcW w:w="3150" w:type="dxa"/>
           </w:tcPr>
           <w:p>
             <w:pPr>
@@ -2158,7 +2985,7 @@
                 <w:lang w:val="nb-NO"/>
               </w:rPr>
             </w:pPr>
-            <w:hyperlink r:id="rId38" w:history="1">
+            <w:hyperlink r:id="rId40" w:history="1">
               <w:r>
                 <w:rPr>
                   <w:rStyle w:val="Hyperlink"/>
@@ -2179,7 +3006,7 @@
                 <w:lang w:val="nb-NO"/>
               </w:rPr>
             </w:pPr>
-            <w:hyperlink r:id="rId39" w:history="1">
+            <w:hyperlink r:id="rId41" w:history="1">
               <w:r>
                 <w:rPr>
                   <w:rStyle w:val="Hyperlink"/>
@@ -2199,7 +3026,7 @@
                 <w:szCs w:val="22"/>
               </w:rPr>
             </w:pPr>
-            <w:hyperlink r:id="rId40" w:history="1">
+            <w:hyperlink r:id="rId42" w:history="1">
               <w:r>
                 <w:rPr>
                   <w:rStyle w:val="Hyperlink"/>
@@ -2218,7 +3045,7 @@
                 <w:szCs w:val="22"/>
               </w:rPr>
             </w:pPr>
-            <w:hyperlink r:id="rId41" w:history="1">
+            <w:hyperlink r:id="rId43" w:history="1">
               <w:r>
                 <w:rPr>
                   <w:rStyle w:val="Hyperlink"/>
@@ -2237,7 +3064,7 @@
                 <w:szCs w:val="22"/>
               </w:rPr>
             </w:pPr>
-            <w:hyperlink r:id="rId42" w:history="1">
+            <w:hyperlink r:id="rId44" w:history="1">
               <w:r>
                 <w:rPr>
                   <w:rStyle w:val="Hyperlink"/>
@@ -2256,7 +3083,7 @@
                 <w:szCs w:val="22"/>
               </w:rPr>
             </w:pPr>
-            <w:hyperlink r:id="rId43" w:history="1">
+            <w:hyperlink r:id="rId45" w:history="1">
               <w:r>
                 <w:rPr>
                   <w:rStyle w:val="Hyperlink"/>
@@ -2305,7 +3132,7 @@
         </w:tc>
         <w:tc>
           <w:tcPr>
-            <w:tcW w:w="3960" w:type="dxa"/>
+            <w:tcW w:w="4950" w:type="dxa"/>
           </w:tcPr>
           <w:p>
             <w:pPr>
@@ -2314,40 +3141,22 @@
                 <w:rFonts w:ascii="Segoe UI" w:hAnsi="Segoe UI" w:cs="Segoe UI"/>
                 <w:sz w:val="22"/>
                 <w:szCs w:val="22"/>
-              </w:rPr>
-            </w:pPr>
-            <w:r>
-              <w:rPr>
-                <w:rFonts w:ascii="Segoe UI" w:hAnsi="Segoe UI" w:cs="Segoe UI"/>
-                <w:sz w:val="22"/>
-                <w:szCs w:val="22"/>
-              </w:rPr>
-              <w:t xml:space="preserve">Title less column </w:t>
-            </w:r>
-            <w:r>
-              <w:rPr>
-                <w:rFonts w:ascii="Segoe UI" w:hAnsi="Segoe UI" w:cs="Segoe UI"/>
-                <w:sz w:val="22"/>
-                <w:szCs w:val="22"/>
-              </w:rPr>
-              <w:t>is sortable</w:t>
-            </w:r>
-          </w:p>
-          <w:p>
-            <w:pPr>
-              <w:cnfStyle w:val="000000000000" w:firstRow="0" w:lastRow="0" w:firstColumn="0" w:lastColumn="0" w:oddVBand="0" w:evenVBand="0" w:oddHBand="0" w:evenHBand="0" w:firstRowFirstColumn="0" w:firstRowLastColumn="0" w:lastRowFirstColumn="0" w:lastRowLastColumn="0"/>
-              <w:rPr>
-                <w:rFonts w:ascii="Segoe UI" w:hAnsi="Segoe UI" w:cs="Segoe UI"/>
-                <w:sz w:val="22"/>
-                <w:szCs w:val="22"/>
                 <w:lang w:val="en-IN"/>
               </w:rPr>
             </w:pPr>
+            <w:r>
+              <w:rPr>
+                <w:rFonts w:ascii="Segoe UI" w:hAnsi="Segoe UI" w:cs="Segoe UI"/>
+                <w:sz w:val="22"/>
+                <w:szCs w:val="22"/>
+              </w:rPr>
+              <w:t>PropertyColumn without an explicit Title</w:t>
+            </w:r>
           </w:p>
         </w:tc>
         <w:tc>
           <w:tcPr>
-            <w:tcW w:w="1260" w:type="dxa"/>
+            <w:tcW w:w="1080" w:type="dxa"/>
           </w:tcPr>
           <w:p>
             <w:pPr>
@@ -2369,7 +3178,7 @@
         </w:tc>
         <w:tc>
           <w:tcPr>
-            <w:tcW w:w="3960" w:type="dxa"/>
+            <w:tcW w:w="3150" w:type="dxa"/>
           </w:tcPr>
           <w:p>
             <w:pPr>
@@ -2379,7 +3188,7 @@
                 <w:szCs w:val="22"/>
               </w:rPr>
             </w:pPr>
-            <w:hyperlink r:id="rId44" w:history="1">
+            <w:hyperlink r:id="rId46" w:history="1">
               <w:r>
                 <w:rPr>
                   <w:rStyle w:val="Hyperlink"/>
@@ -2398,7 +3207,7 @@
                 <w:szCs w:val="22"/>
               </w:rPr>
             </w:pPr>
-            <w:hyperlink r:id="rId45" w:history="1">
+            <w:hyperlink r:id="rId47" w:history="1">
               <w:r>
                 <w:rPr>
                   <w:rStyle w:val="Hyperlink"/>
@@ -2417,7 +3226,7 @@
                 <w:szCs w:val="22"/>
               </w:rPr>
             </w:pPr>
-            <w:hyperlink r:id="rId46" w:history="1">
+            <w:hyperlink r:id="rId48" w:history="1">
               <w:r>
                 <w:rPr>
                   <w:rStyle w:val="Hyperlink"/>
@@ -2463,13 +3272,14 @@
                 <w:sz w:val="22"/>
                 <w:szCs w:val="22"/>
               </w:rPr>
+              <w:lastRenderedPageBreak/>
               <w:t>13</w:t>
             </w:r>
           </w:p>
         </w:tc>
         <w:tc>
           <w:tcPr>
-            <w:tcW w:w="3960" w:type="dxa"/>
+            <w:tcW w:w="4950" w:type="dxa"/>
           </w:tcPr>
           <w:p>
             <w:pPr>
@@ -2480,6 +3290,32 @@
                 <w:szCs w:val="22"/>
               </w:rPr>
             </w:pPr>
+            <w:r>
+              <w:rPr>
+                <w:rFonts w:ascii="Segoe UI" w:hAnsi="Segoe UI" w:cs="Segoe UI"/>
+                <w:sz w:val="22"/>
+                <w:szCs w:val="22"/>
+                <w:highlight w:val="yellow"/>
+              </w:rPr>
+              <w:t>Must Hold</w:t>
+            </w:r>
+            <w:r>
+              <w:rPr>
+                <w:rFonts w:ascii="Segoe UI" w:hAnsi="Segoe UI" w:cs="Segoe UI"/>
+                <w:sz w:val="22"/>
+                <w:szCs w:val="22"/>
+                <w:highlight w:val="yellow"/>
+              </w:rPr>
+              <w:t xml:space="preserve"> Scenario</w:t>
+            </w:r>
+            <w:r>
+              <w:rPr>
+                <w:rFonts w:ascii="Segoe UI" w:hAnsi="Segoe UI" w:cs="Segoe UI"/>
+                <w:sz w:val="22"/>
+                <w:szCs w:val="22"/>
+              </w:rPr>
+              <w:t xml:space="preserve"> - </w:t>
+            </w:r>
             <w:r>
               <w:rPr>
                 <w:rFonts w:ascii="Segoe UI" w:hAnsi="Segoe UI" w:cs="Segoe UI"/>
@@ -2617,6 +3453,142 @@
                 <w:szCs w:val="22"/>
               </w:rPr>
               <w:t>?sort=Name</w:t>
+            </w:r>
+            <w:r>
+              <w:rPr>
+                <w:rFonts w:ascii="Segoe UI" w:hAnsi="Segoe UI" w:cs="Segoe UI"/>
+                <w:sz w:val="22"/>
+                <w:szCs w:val="22"/>
+              </w:rPr>
+              <w:br/>
+            </w:r>
+          </w:p>
+          <w:p>
+            <w:pPr>
+              <w:cnfStyle w:val="000000100000" w:firstRow="0" w:lastRow="0" w:firstColumn="0" w:lastColumn="0" w:oddVBand="0" w:evenVBand="0" w:oddHBand="1" w:evenHBand="0" w:firstRowFirstColumn="0" w:firstRowLastColumn="0" w:lastRowFirstColumn="0" w:lastRowLastColumn="0"/>
+              <w:rPr>
+                <w:rFonts w:ascii="Segoe UI" w:hAnsi="Segoe UI" w:cs="Segoe UI"/>
+                <w:b/>
+                <w:bCs/>
+                <w:sz w:val="22"/>
+                <w:szCs w:val="22"/>
+              </w:rPr>
+            </w:pPr>
+            <w:r>
+              <w:rPr>
+                <w:rFonts w:ascii="Segoe UI" w:hAnsi="Segoe UI" w:cs="Segoe UI"/>
+                <w:b/>
+                <w:bCs/>
+                <w:sz w:val="22"/>
+                <w:szCs w:val="22"/>
+              </w:rPr>
+              <w:t>Recorded Output in all render modes:</w:t>
+            </w:r>
+          </w:p>
+          <w:p>
+            <w:pPr>
+              <w:cnfStyle w:val="000000100000" w:firstRow="0" w:lastRow="0" w:firstColumn="0" w:lastColumn="0" w:oddVBand="0" w:evenVBand="0" w:oddHBand="1" w:evenHBand="0" w:firstRowFirstColumn="0" w:firstRowLastColumn="0" w:lastRowFirstColumn="0" w:lastRowLastColumn="0"/>
+              <w:rPr>
+                <w:rFonts w:ascii="Segoe UI" w:hAnsi="Segoe UI" w:cs="Segoe UI"/>
+                <w:sz w:val="22"/>
+                <w:szCs w:val="22"/>
+              </w:rPr>
+            </w:pPr>
+            <w:r>
+              <w:rPr>
+                <w:rFonts w:ascii="Segoe UI" w:hAnsi="Segoe UI" w:cs="Segoe UI"/>
+                <w:sz w:val="22"/>
+                <w:szCs w:val="22"/>
+              </w:rPr>
+              <w:t>Navigation type: Fresh direct load</w:t>
+            </w:r>
+          </w:p>
+          <w:p>
+            <w:pPr>
+              <w:cnfStyle w:val="000000100000" w:firstRow="0" w:lastRow="0" w:firstColumn="0" w:lastColumn="0" w:oddVBand="0" w:evenVBand="0" w:oddHBand="1" w:evenHBand="0" w:firstRowFirstColumn="0" w:firstRowLastColumn="0" w:lastRowFirstColumn="0" w:lastRowLastColumn="0"/>
+              <w:rPr>
+                <w:rFonts w:ascii="Segoe UI" w:hAnsi="Segoe UI" w:cs="Segoe UI"/>
+                <w:sz w:val="22"/>
+                <w:szCs w:val="22"/>
+              </w:rPr>
+            </w:pPr>
+            <w:r>
+              <w:rPr>
+                <w:rFonts w:ascii="Segoe UI" w:hAnsi="Segoe UI" w:cs="Segoe UI"/>
+                <w:sz w:val="22"/>
+                <w:szCs w:val="22"/>
+              </w:rPr>
+              <w:t>Method: Complete malformed URL pasted into a new InPrivate browser window</w:t>
+            </w:r>
+          </w:p>
+          <w:p>
+            <w:pPr>
+              <w:cnfStyle w:val="000000100000" w:firstRow="0" w:lastRow="0" w:firstColumn="0" w:lastColumn="0" w:oddVBand="0" w:evenVBand="0" w:oddHBand="1" w:evenHBand="0" w:firstRowFirstColumn="0" w:firstRowLastColumn="0" w:lastRowFirstColumn="0" w:lastRowLastColumn="0"/>
+              <w:rPr>
+                <w:rFonts w:ascii="Segoe UI" w:hAnsi="Segoe UI" w:cs="Segoe UI"/>
+                <w:sz w:val="22"/>
+                <w:szCs w:val="22"/>
+              </w:rPr>
+            </w:pPr>
+            <w:r>
+              <w:rPr>
+                <w:rFonts w:ascii="Segoe UI" w:hAnsi="Segoe UI" w:cs="Segoe UI"/>
+                <w:sz w:val="22"/>
+                <w:szCs w:val="22"/>
+              </w:rPr>
+              <w:t>HTTP evidence: Network document request returned 200 OK</w:t>
+            </w:r>
+          </w:p>
+          <w:p>
+            <w:pPr>
+              <w:cnfStyle w:val="000000100000" w:firstRow="0" w:lastRow="0" w:firstColumn="0" w:lastColumn="0" w:oddVBand="0" w:evenVBand="0" w:oddHBand="1" w:evenHBand="0" w:firstRowFirstColumn="0" w:firstRowLastColumn="0" w:lastRowFirstColumn="0" w:lastRowLastColumn="0"/>
+              <w:rPr>
+                <w:rFonts w:ascii="Segoe UI" w:hAnsi="Segoe UI" w:cs="Segoe UI"/>
+                <w:sz w:val="22"/>
+                <w:szCs w:val="22"/>
+              </w:rPr>
+            </w:pPr>
+            <w:r>
+              <w:rPr>
+                <w:rFonts w:ascii="Segoe UI" w:hAnsi="Segoe UI" w:cs="Segoe UI"/>
+                <w:sz w:val="22"/>
+                <w:szCs w:val="22"/>
+              </w:rPr>
+              <w:t xml:space="preserve">Fallback: Price </w:t>
+            </w:r>
+            <w:proofErr w:type="gramStart"/>
+            <w:r>
+              <w:rPr>
+                <w:rFonts w:ascii="Segoe UI" w:hAnsi="Segoe UI" w:cs="Segoe UI"/>
+                <w:sz w:val="22"/>
+                <w:szCs w:val="22"/>
+              </w:rPr>
+              <w:t>sort</w:t>
+            </w:r>
+            <w:proofErr w:type="gramEnd"/>
+            <w:r>
+              <w:rPr>
+                <w:rFonts w:ascii="Segoe UI" w:hAnsi="Segoe UI" w:cs="Segoe UI"/>
+                <w:sz w:val="22"/>
+                <w:szCs w:val="22"/>
+              </w:rPr>
+              <w:t xml:space="preserve"> to </w:t>
+            </w:r>
+            <w:r>
+              <w:rPr>
+                <w:rFonts w:ascii="Segoe UI" w:hAnsi="Segoe UI" w:cs="Segoe UI"/>
+                <w:sz w:val="22"/>
+                <w:szCs w:val="22"/>
+              </w:rPr>
+              <w:t>ascending</w:t>
+            </w:r>
+            <w:r>
+              <w:rPr>
+                <w:rFonts w:ascii="Segoe UI" w:hAnsi="Segoe UI" w:cs="Segoe UI"/>
+                <w:sz w:val="22"/>
+                <w:szCs w:val="22"/>
+              </w:rPr>
+              <w:t xml:space="preserve"> (default sort)</w:t>
             </w:r>
           </w:p>
           <w:p>
@@ -2632,7 +3604,7 @@
         </w:tc>
         <w:tc>
           <w:tcPr>
-            <w:tcW w:w="1260" w:type="dxa"/>
+            <w:tcW w:w="1080" w:type="dxa"/>
           </w:tcPr>
           <w:p>
             <w:pPr>
@@ -2654,7 +3626,7 @@
         </w:tc>
         <w:tc>
           <w:tcPr>
-            <w:tcW w:w="3960" w:type="dxa"/>
+            <w:tcW w:w="3150" w:type="dxa"/>
           </w:tcPr>
           <w:p>
             <w:pPr>
@@ -2664,7 +3636,7 @@
                 <w:szCs w:val="22"/>
               </w:rPr>
             </w:pPr>
-            <w:hyperlink r:id="rId47" w:history="1">
+            <w:hyperlink r:id="rId49" w:history="1">
               <w:r>
                 <w:rPr>
                   <w:rStyle w:val="Hyperlink"/>
@@ -2683,7 +3655,7 @@
                 <w:szCs w:val="22"/>
               </w:rPr>
             </w:pPr>
-            <w:hyperlink r:id="rId48" w:history="1">
+            <w:hyperlink r:id="rId50" w:history="1">
               <w:r>
                 <w:rPr>
                   <w:rStyle w:val="Hyperlink"/>
@@ -2702,7 +3674,7 @@
                 <w:szCs w:val="22"/>
               </w:rPr>
             </w:pPr>
-            <w:hyperlink r:id="rId49" w:history="1">
+            <w:hyperlink r:id="rId51" w:history="1">
               <w:r>
                 <w:rPr>
                   <w:rStyle w:val="Hyperlink"/>
@@ -2726,14 +3698,74 @@
         </w:rPr>
       </w:pPr>
     </w:p>
+    <w:p>
+      <w:pPr>
+        <w:rPr>
+          <w:rFonts w:ascii="Segoe UI" w:hAnsi="Segoe UI" w:cs="Segoe UI"/>
+          <w:sz w:val="22"/>
+          <w:szCs w:val="22"/>
+          <w:lang w:val="en-IN"/>
+        </w:rPr>
+      </w:pPr>
+    </w:p>
     <w:sectPr>
       <w:pgSz w:w="12240" w:h="15840"/>
-      <w:pgMar w:top="1440" w:right="1440" w:bottom="1440" w:left="1440" w:header="720" w:footer="720" w:gutter="0"/>
+      <w:pgMar w:top="1440" w:right="1440" w:bottom="1440" w:left="1440" w:header="0" w:footer="720" w:gutter="0"/>
       <w:cols w:space="720"/>
       <w:docGrid w:linePitch="360"/>
     </w:sectPr>
   </w:body>
 </w:document>
+</file>
+
+<file path=word/endnotes.xml><?xml version="1.0" encoding="utf-8"?>
+<w:endnotes xmlns:wpc="http://schemas.microsoft.com/office/word/2010/wordprocessingCanvas" xmlns:cx="http://schemas.microsoft.com/office/drawing/2014/chartex" xmlns:cx1="http://schemas.microsoft.com/office/drawing/2015/9/8/chartex" xmlns:cx2="http://schemas.microsoft.com/office/drawing/2015/10/21/chartex" xmlns:cx3="http://schemas.microsoft.com/office/drawing/2016/5/9/chartex" xmlns:cx4="http://schemas.microsoft.com/office/drawing/2016/5/10/chartex" xmlns:cx5="http://schemas.microsoft.com/office/drawing/2016/5/11/chartex" xmlns:cx6="http://schemas.microsoft.com/office/drawing/2016/5/12/chartex" xmlns:cx7="http://schemas.microsoft.com/office/drawing/2016/5/13/chartex" xmlns:cx8="http://schemas.microsoft.com/office/drawing/2016/5/14/chartex" xmlns:mc="http://schemas.openxmlformats.org/markup-compatibility/2006" xmlns:aink="http://schemas.microsoft.com/office/drawing/2016/ink" xmlns:am3d="http://schemas.microsoft.com/office/drawing/2017/model3d" xmlns:o="urn:schemas-microsoft-com:office:office" xmlns:oel="http://schemas.microsoft.com/office/2019/extlst" xmlns:r="http://schemas.openxmlformats.org/officeDocument/2006/relationships" xmlns:m="http://schemas.openxmlformats.org/officeDocument/2006/math" xmlns:v="urn:schemas-microsoft-com:vml" xmlns:wp14="http://schemas.microsoft.com/office/word/2010/wordprocessingDrawing" xmlns:wp="http://schemas.openxmlformats.org/drawingml/2006/wordprocessingDrawing" xmlns:w10="urn:schemas-microsoft-com:office:word" xmlns:w="http://schemas.openxmlformats.org/wordprocessingml/2006/main" xmlns:w14="http://schemas.microsoft.com/office/word/2010/wordml" xmlns:w15="http://schemas.microsoft.com/office/word/2012/wordml" xmlns:w16cex="http://schemas.microsoft.com/office/word/2018/wordml/cex" xmlns:w16cid="http://schemas.microsoft.com/office/word/2016/wordml/cid" xmlns:w16="http://schemas.microsoft.com/office/word/2018/wordml" xmlns:w16du="http://schemas.microsoft.com/office/word/2023/wordml/word16du" xmlns:w16sdtdh="http://schemas.microsoft.com/office/word/2020/wordml/sdtdatahash" xmlns:w16sdtfl="http://schemas.microsoft.com/office/word/2024/wordml/sdtformatlock" xmlns:w16se="http://schemas.microsoft.com/office/word/2015/wordml/symex" xmlns:wpg="http://schemas.microsoft.com/office/word/2010/wordprocessingGroup" xmlns:wpi="http://schemas.microsoft.com/office/word/2010/wordprocessingInk" xmlns:wne="http://schemas.microsoft.com/office/word/2006/wordml" xmlns:wps="http://schemas.microsoft.com/office/word/2010/wordprocessingShape" mc:Ignorable="w14 w15 w16se w16cid w16 w16cex w16sdtdh w16sdtfl w16du wp14">
+  <w:endnote w:type="separator" w:id="-1">
+    <w:p>
+      <w:pPr>
+        <w:spacing w:after="0" w:line="240" w:lineRule="auto"/>
+      </w:pPr>
+      <w:r>
+        <w:separator/>
+      </w:r>
+    </w:p>
+  </w:endnote>
+  <w:endnote w:type="continuationSeparator" w:id="0">
+    <w:p>
+      <w:pPr>
+        <w:spacing w:after="0" w:line="240" w:lineRule="auto"/>
+      </w:pPr>
+      <w:r>
+        <w:continuationSeparator/>
+      </w:r>
+    </w:p>
+  </w:endnote>
+</w:endnotes>
+</file>
+
+<file path=word/footnotes.xml><?xml version="1.0" encoding="utf-8"?>
+<w:footnotes xmlns:wpc="http://schemas.microsoft.com/office/word/2010/wordprocessingCanvas" xmlns:cx="http://schemas.microsoft.com/office/drawing/2014/chartex" xmlns:cx1="http://schemas.microsoft.com/office/drawing/2015/9/8/chartex" xmlns:cx2="http://schemas.microsoft.com/office/drawing/2015/10/21/chartex" xmlns:cx3="http://schemas.microsoft.com/office/drawing/2016/5/9/chartex" xmlns:cx4="http://schemas.microsoft.com/office/drawing/2016/5/10/chartex" xmlns:cx5="http://schemas.microsoft.com/office/drawing/2016/5/11/chartex" xmlns:cx6="http://schemas.microsoft.com/office/drawing/2016/5/12/chartex" xmlns:cx7="http://schemas.microsoft.com/office/drawing/2016/5/13/chartex" xmlns:cx8="http://schemas.microsoft.com/office/drawing/2016/5/14/chartex" xmlns:mc="http://schemas.openxmlformats.org/markup-compatibility/2006" xmlns:aink="http://schemas.microsoft.com/office/drawing/2016/ink" xmlns:am3d="http://schemas.microsoft.com/office/drawing/2017/model3d" xmlns:o="urn:schemas-microsoft-com:office:office" xmlns:oel="http://schemas.microsoft.com/office/2019/extlst" xmlns:r="http://schemas.openxmlformats.org/officeDocument/2006/relationships" xmlns:m="http://schemas.openxmlformats.org/officeDocument/2006/math" xmlns:v="urn:schemas-microsoft-com:vml" xmlns:wp14="http://schemas.microsoft.com/office/word/2010/wordprocessingDrawing" xmlns:wp="http://schemas.openxmlformats.org/drawingml/2006/wordprocessingDrawing" xmlns:w10="urn:schemas-microsoft-com:office:word" xmlns:w="http://schemas.openxmlformats.org/wordprocessingml/2006/main" xmlns:w14="http://schemas.microsoft.com/office/word/2010/wordml" xmlns:w15="http://schemas.microsoft.com/office/word/2012/wordml" xmlns:w16cex="http://schemas.microsoft.com/office/word/2018/wordml/cex" xmlns:w16cid="http://schemas.microsoft.com/office/word/2016/wordml/cid" xmlns:w16="http://schemas.microsoft.com/office/word/2018/wordml" xmlns:w16du="http://schemas.microsoft.com/office/word/2023/wordml/word16du" xmlns:w16sdtdh="http://schemas.microsoft.com/office/word/2020/wordml/sdtdatahash" xmlns:w16sdtfl="http://schemas.microsoft.com/office/word/2024/wordml/sdtformatlock" xmlns:w16se="http://schemas.microsoft.com/office/word/2015/wordml/symex" xmlns:wpg="http://schemas.microsoft.com/office/word/2010/wordprocessingGroup" xmlns:wpi="http://schemas.microsoft.com/office/word/2010/wordprocessingInk" xmlns:wne="http://schemas.microsoft.com/office/word/2006/wordml" xmlns:wps="http://schemas.microsoft.com/office/word/2010/wordprocessingShape" mc:Ignorable="w14 w15 w16se w16cid w16 w16cex w16sdtdh w16sdtfl w16du wp14">
+  <w:footnote w:type="separator" w:id="-1">
+    <w:p>
+      <w:pPr>
+        <w:spacing w:after="0" w:line="240" w:lineRule="auto"/>
+      </w:pPr>
+      <w:r>
+        <w:separator/>
+      </w:r>
+    </w:p>
+  </w:footnote>
+  <w:footnote w:type="continuationSeparator" w:id="0">
+    <w:p>
+      <w:pPr>
+        <w:spacing w:after="0" w:line="240" w:lineRule="auto"/>
+      </w:pPr>
+      <w:r>
+        <w:continuationSeparator/>
+      </w:r>
+    </w:p>
+  </w:footnote>
+</w:footnotes>
 </file>
 
 <file path=word/numbering.xml><?xml version="1.0" encoding="utf-8"?>
@@ -3182,6 +4214,119 @@
     </w:lvl>
   </w:abstractNum>
   <w:abstractNum w:abstractNumId="4" w15:restartNumberingAfterBreak="0">
+    <w:nsid w:val="08B5303B"/>
+    <w:multiLevelType w:val="hybridMultilevel"/>
+    <w:tmpl w:val="298E9108"/>
+    <w:lvl w:ilvl="0" w:tplc="40090001">
+      <w:start w:val="1"/>
+      <w:numFmt w:val="bullet"/>
+      <w:lvlText w:val=""/>
+      <w:lvlJc w:val="left"/>
+      <w:pPr>
+        <w:ind w:left="720" w:hanging="360"/>
+      </w:pPr>
+      <w:rPr>
+        <w:rFonts w:ascii="Symbol" w:hAnsi="Symbol" w:hint="default"/>
+      </w:rPr>
+    </w:lvl>
+    <w:lvl w:ilvl="1" w:tplc="40090003" w:tentative="1">
+      <w:start w:val="1"/>
+      <w:numFmt w:val="bullet"/>
+      <w:lvlText w:val="o"/>
+      <w:lvlJc w:val="left"/>
+      <w:pPr>
+        <w:ind w:left="1440" w:hanging="360"/>
+      </w:pPr>
+      <w:rPr>
+        <w:rFonts w:ascii="Courier New" w:hAnsi="Courier New" w:cs="Courier New" w:hint="default"/>
+      </w:rPr>
+    </w:lvl>
+    <w:lvl w:ilvl="2" w:tplc="40090005" w:tentative="1">
+      <w:start w:val="1"/>
+      <w:numFmt w:val="bullet"/>
+      <w:lvlText w:val=""/>
+      <w:lvlJc w:val="left"/>
+      <w:pPr>
+        <w:ind w:left="2160" w:hanging="360"/>
+      </w:pPr>
+      <w:rPr>
+        <w:rFonts w:ascii="Wingdings" w:hAnsi="Wingdings" w:hint="default"/>
+      </w:rPr>
+    </w:lvl>
+    <w:lvl w:ilvl="3" w:tplc="40090001" w:tentative="1">
+      <w:start w:val="1"/>
+      <w:numFmt w:val="bullet"/>
+      <w:lvlText w:val=""/>
+      <w:lvlJc w:val="left"/>
+      <w:pPr>
+        <w:ind w:left="2880" w:hanging="360"/>
+      </w:pPr>
+      <w:rPr>
+        <w:rFonts w:ascii="Symbol" w:hAnsi="Symbol" w:hint="default"/>
+      </w:rPr>
+    </w:lvl>
+    <w:lvl w:ilvl="4" w:tplc="40090003" w:tentative="1">
+      <w:start w:val="1"/>
+      <w:numFmt w:val="bullet"/>
+      <w:lvlText w:val="o"/>
+      <w:lvlJc w:val="left"/>
+      <w:pPr>
+        <w:ind w:left="3600" w:hanging="360"/>
+      </w:pPr>
+      <w:rPr>
+        <w:rFonts w:ascii="Courier New" w:hAnsi="Courier New" w:cs="Courier New" w:hint="default"/>
+      </w:rPr>
+    </w:lvl>
+    <w:lvl w:ilvl="5" w:tplc="40090005" w:tentative="1">
+      <w:start w:val="1"/>
+      <w:numFmt w:val="bullet"/>
+      <w:lvlText w:val=""/>
+      <w:lvlJc w:val="left"/>
+      <w:pPr>
+        <w:ind w:left="4320" w:hanging="360"/>
+      </w:pPr>
+      <w:rPr>
+        <w:rFonts w:ascii="Wingdings" w:hAnsi="Wingdings" w:hint="default"/>
+      </w:rPr>
+    </w:lvl>
+    <w:lvl w:ilvl="6" w:tplc="40090001" w:tentative="1">
+      <w:start w:val="1"/>
+      <w:numFmt w:val="bullet"/>
+      <w:lvlText w:val=""/>
+      <w:lvlJc w:val="left"/>
+      <w:pPr>
+        <w:ind w:left="5040" w:hanging="360"/>
+      </w:pPr>
+      <w:rPr>
+        <w:rFonts w:ascii="Symbol" w:hAnsi="Symbol" w:hint="default"/>
+      </w:rPr>
+    </w:lvl>
+    <w:lvl w:ilvl="7" w:tplc="40090003" w:tentative="1">
+      <w:start w:val="1"/>
+      <w:numFmt w:val="bullet"/>
+      <w:lvlText w:val="o"/>
+      <w:lvlJc w:val="left"/>
+      <w:pPr>
+        <w:ind w:left="5760" w:hanging="360"/>
+      </w:pPr>
+      <w:rPr>
+        <w:rFonts w:ascii="Courier New" w:hAnsi="Courier New" w:cs="Courier New" w:hint="default"/>
+      </w:rPr>
+    </w:lvl>
+    <w:lvl w:ilvl="8" w:tplc="40090005" w:tentative="1">
+      <w:start w:val="1"/>
+      <w:numFmt w:val="bullet"/>
+      <w:lvlText w:val=""/>
+      <w:lvlJc w:val="left"/>
+      <w:pPr>
+        <w:ind w:left="6480" w:hanging="360"/>
+      </w:pPr>
+      <w:rPr>
+        <w:rFonts w:ascii="Wingdings" w:hAnsi="Wingdings" w:hint="default"/>
+      </w:rPr>
+    </w:lvl>
+  </w:abstractNum>
+  <w:abstractNum w:abstractNumId="5" w15:restartNumberingAfterBreak="0">
     <w:nsid w:val="131409D4"/>
     <w:multiLevelType w:val="multilevel"/>
     <w:tmpl w:val="586C8B2E"/>
@@ -3330,7 +4475,7 @@
       </w:rPr>
     </w:lvl>
   </w:abstractNum>
-  <w:abstractNum w:abstractNumId="5" w15:restartNumberingAfterBreak="0">
+  <w:abstractNum w:abstractNumId="6" w15:restartNumberingAfterBreak="0">
     <w:nsid w:val="233E4865"/>
     <w:multiLevelType w:val="hybridMultilevel"/>
     <w:tmpl w:val="0B14582C"/>
@@ -3416,7 +4561,120 @@
       </w:pPr>
     </w:lvl>
   </w:abstractNum>
-  <w:abstractNum w:abstractNumId="6" w15:restartNumberingAfterBreak="0">
+  <w:abstractNum w:abstractNumId="7" w15:restartNumberingAfterBreak="0">
+    <w:nsid w:val="258D46B3"/>
+    <w:multiLevelType w:val="hybridMultilevel"/>
+    <w:tmpl w:val="0CFEE1BA"/>
+    <w:lvl w:ilvl="0" w:tplc="40090001">
+      <w:start w:val="1"/>
+      <w:numFmt w:val="bullet"/>
+      <w:lvlText w:val=""/>
+      <w:lvlJc w:val="left"/>
+      <w:pPr>
+        <w:ind w:left="720" w:hanging="360"/>
+      </w:pPr>
+      <w:rPr>
+        <w:rFonts w:ascii="Symbol" w:hAnsi="Symbol" w:hint="default"/>
+      </w:rPr>
+    </w:lvl>
+    <w:lvl w:ilvl="1" w:tplc="40090003" w:tentative="1">
+      <w:start w:val="1"/>
+      <w:numFmt w:val="bullet"/>
+      <w:lvlText w:val="o"/>
+      <w:lvlJc w:val="left"/>
+      <w:pPr>
+        <w:ind w:left="1440" w:hanging="360"/>
+      </w:pPr>
+      <w:rPr>
+        <w:rFonts w:ascii="Courier New" w:hAnsi="Courier New" w:cs="Courier New" w:hint="default"/>
+      </w:rPr>
+    </w:lvl>
+    <w:lvl w:ilvl="2" w:tplc="40090005" w:tentative="1">
+      <w:start w:val="1"/>
+      <w:numFmt w:val="bullet"/>
+      <w:lvlText w:val=""/>
+      <w:lvlJc w:val="left"/>
+      <w:pPr>
+        <w:ind w:left="2160" w:hanging="360"/>
+      </w:pPr>
+      <w:rPr>
+        <w:rFonts w:ascii="Wingdings" w:hAnsi="Wingdings" w:hint="default"/>
+      </w:rPr>
+    </w:lvl>
+    <w:lvl w:ilvl="3" w:tplc="40090001" w:tentative="1">
+      <w:start w:val="1"/>
+      <w:numFmt w:val="bullet"/>
+      <w:lvlText w:val=""/>
+      <w:lvlJc w:val="left"/>
+      <w:pPr>
+        <w:ind w:left="2880" w:hanging="360"/>
+      </w:pPr>
+      <w:rPr>
+        <w:rFonts w:ascii="Symbol" w:hAnsi="Symbol" w:hint="default"/>
+      </w:rPr>
+    </w:lvl>
+    <w:lvl w:ilvl="4" w:tplc="40090003" w:tentative="1">
+      <w:start w:val="1"/>
+      <w:numFmt w:val="bullet"/>
+      <w:lvlText w:val="o"/>
+      <w:lvlJc w:val="left"/>
+      <w:pPr>
+        <w:ind w:left="3600" w:hanging="360"/>
+      </w:pPr>
+      <w:rPr>
+        <w:rFonts w:ascii="Courier New" w:hAnsi="Courier New" w:cs="Courier New" w:hint="default"/>
+      </w:rPr>
+    </w:lvl>
+    <w:lvl w:ilvl="5" w:tplc="40090005" w:tentative="1">
+      <w:start w:val="1"/>
+      <w:numFmt w:val="bullet"/>
+      <w:lvlText w:val=""/>
+      <w:lvlJc w:val="left"/>
+      <w:pPr>
+        <w:ind w:left="4320" w:hanging="360"/>
+      </w:pPr>
+      <w:rPr>
+        <w:rFonts w:ascii="Wingdings" w:hAnsi="Wingdings" w:hint="default"/>
+      </w:rPr>
+    </w:lvl>
+    <w:lvl w:ilvl="6" w:tplc="40090001" w:tentative="1">
+      <w:start w:val="1"/>
+      <w:numFmt w:val="bullet"/>
+      <w:lvlText w:val=""/>
+      <w:lvlJc w:val="left"/>
+      <w:pPr>
+        <w:ind w:left="5040" w:hanging="360"/>
+      </w:pPr>
+      <w:rPr>
+        <w:rFonts w:ascii="Symbol" w:hAnsi="Symbol" w:hint="default"/>
+      </w:rPr>
+    </w:lvl>
+    <w:lvl w:ilvl="7" w:tplc="40090003" w:tentative="1">
+      <w:start w:val="1"/>
+      <w:numFmt w:val="bullet"/>
+      <w:lvlText w:val="o"/>
+      <w:lvlJc w:val="left"/>
+      <w:pPr>
+        <w:ind w:left="5760" w:hanging="360"/>
+      </w:pPr>
+      <w:rPr>
+        <w:rFonts w:ascii="Courier New" w:hAnsi="Courier New" w:cs="Courier New" w:hint="default"/>
+      </w:rPr>
+    </w:lvl>
+    <w:lvl w:ilvl="8" w:tplc="40090005" w:tentative="1">
+      <w:start w:val="1"/>
+      <w:numFmt w:val="bullet"/>
+      <w:lvlText w:val=""/>
+      <w:lvlJc w:val="left"/>
+      <w:pPr>
+        <w:ind w:left="6480" w:hanging="360"/>
+      </w:pPr>
+      <w:rPr>
+        <w:rFonts w:ascii="Wingdings" w:hAnsi="Wingdings" w:hint="default"/>
+      </w:rPr>
+    </w:lvl>
+  </w:abstractNum>
+  <w:abstractNum w:abstractNumId="8" w15:restartNumberingAfterBreak="0">
     <w:nsid w:val="25B53A80"/>
     <w:multiLevelType w:val="hybridMultilevel"/>
     <w:tmpl w:val="218C5626"/>
@@ -3529,7 +4787,7 @@
       </w:rPr>
     </w:lvl>
   </w:abstractNum>
-  <w:abstractNum w:abstractNumId="7" w15:restartNumberingAfterBreak="0">
+  <w:abstractNum w:abstractNumId="9" w15:restartNumberingAfterBreak="0">
     <w:nsid w:val="27B6399F"/>
     <w:multiLevelType w:val="hybridMultilevel"/>
     <w:tmpl w:val="B3B48336"/>
@@ -3642,7 +4900,7 @@
       </w:rPr>
     </w:lvl>
   </w:abstractNum>
-  <w:abstractNum w:abstractNumId="8" w15:restartNumberingAfterBreak="0">
+  <w:abstractNum w:abstractNumId="10" w15:restartNumberingAfterBreak="0">
     <w:nsid w:val="311B0D0F"/>
     <w:multiLevelType w:val="hybridMultilevel"/>
     <w:tmpl w:val="7B2CCD5E"/>
@@ -3755,7 +5013,7 @@
       </w:rPr>
     </w:lvl>
   </w:abstractNum>
-  <w:abstractNum w:abstractNumId="9" w15:restartNumberingAfterBreak="0">
+  <w:abstractNum w:abstractNumId="11" w15:restartNumberingAfterBreak="0">
     <w:nsid w:val="4C175850"/>
     <w:multiLevelType w:val="multilevel"/>
     <w:tmpl w:val="8B386C3C"/>
@@ -3904,7 +5162,120 @@
       </w:rPr>
     </w:lvl>
   </w:abstractNum>
-  <w:abstractNum w:abstractNumId="10" w15:restartNumberingAfterBreak="0">
+  <w:abstractNum w:abstractNumId="12" w15:restartNumberingAfterBreak="0">
+    <w:nsid w:val="5E0E0E55"/>
+    <w:multiLevelType w:val="hybridMultilevel"/>
+    <w:tmpl w:val="F4B44ABE"/>
+    <w:lvl w:ilvl="0" w:tplc="40090001">
+      <w:start w:val="1"/>
+      <w:numFmt w:val="bullet"/>
+      <w:lvlText w:val=""/>
+      <w:lvlJc w:val="left"/>
+      <w:pPr>
+        <w:ind w:left="720" w:hanging="360"/>
+      </w:pPr>
+      <w:rPr>
+        <w:rFonts w:ascii="Symbol" w:hAnsi="Symbol" w:hint="default"/>
+      </w:rPr>
+    </w:lvl>
+    <w:lvl w:ilvl="1" w:tplc="40090003" w:tentative="1">
+      <w:start w:val="1"/>
+      <w:numFmt w:val="bullet"/>
+      <w:lvlText w:val="o"/>
+      <w:lvlJc w:val="left"/>
+      <w:pPr>
+        <w:ind w:left="1440" w:hanging="360"/>
+      </w:pPr>
+      <w:rPr>
+        <w:rFonts w:ascii="Courier New" w:hAnsi="Courier New" w:cs="Courier New" w:hint="default"/>
+      </w:rPr>
+    </w:lvl>
+    <w:lvl w:ilvl="2" w:tplc="40090005" w:tentative="1">
+      <w:start w:val="1"/>
+      <w:numFmt w:val="bullet"/>
+      <w:lvlText w:val=""/>
+      <w:lvlJc w:val="left"/>
+      <w:pPr>
+        <w:ind w:left="2160" w:hanging="360"/>
+      </w:pPr>
+      <w:rPr>
+        <w:rFonts w:ascii="Wingdings" w:hAnsi="Wingdings" w:hint="default"/>
+      </w:rPr>
+    </w:lvl>
+    <w:lvl w:ilvl="3" w:tplc="40090001" w:tentative="1">
+      <w:start w:val="1"/>
+      <w:numFmt w:val="bullet"/>
+      <w:lvlText w:val=""/>
+      <w:lvlJc w:val="left"/>
+      <w:pPr>
+        <w:ind w:left="2880" w:hanging="360"/>
+      </w:pPr>
+      <w:rPr>
+        <w:rFonts w:ascii="Symbol" w:hAnsi="Symbol" w:hint="default"/>
+      </w:rPr>
+    </w:lvl>
+    <w:lvl w:ilvl="4" w:tplc="40090003" w:tentative="1">
+      <w:start w:val="1"/>
+      <w:numFmt w:val="bullet"/>
+      <w:lvlText w:val="o"/>
+      <w:lvlJc w:val="left"/>
+      <w:pPr>
+        <w:ind w:left="3600" w:hanging="360"/>
+      </w:pPr>
+      <w:rPr>
+        <w:rFonts w:ascii="Courier New" w:hAnsi="Courier New" w:cs="Courier New" w:hint="default"/>
+      </w:rPr>
+    </w:lvl>
+    <w:lvl w:ilvl="5" w:tplc="40090005" w:tentative="1">
+      <w:start w:val="1"/>
+      <w:numFmt w:val="bullet"/>
+      <w:lvlText w:val=""/>
+      <w:lvlJc w:val="left"/>
+      <w:pPr>
+        <w:ind w:left="4320" w:hanging="360"/>
+      </w:pPr>
+      <w:rPr>
+        <w:rFonts w:ascii="Wingdings" w:hAnsi="Wingdings" w:hint="default"/>
+      </w:rPr>
+    </w:lvl>
+    <w:lvl w:ilvl="6" w:tplc="40090001" w:tentative="1">
+      <w:start w:val="1"/>
+      <w:numFmt w:val="bullet"/>
+      <w:lvlText w:val=""/>
+      <w:lvlJc w:val="left"/>
+      <w:pPr>
+        <w:ind w:left="5040" w:hanging="360"/>
+      </w:pPr>
+      <w:rPr>
+        <w:rFonts w:ascii="Symbol" w:hAnsi="Symbol" w:hint="default"/>
+      </w:rPr>
+    </w:lvl>
+    <w:lvl w:ilvl="7" w:tplc="40090003" w:tentative="1">
+      <w:start w:val="1"/>
+      <w:numFmt w:val="bullet"/>
+      <w:lvlText w:val="o"/>
+      <w:lvlJc w:val="left"/>
+      <w:pPr>
+        <w:ind w:left="5760" w:hanging="360"/>
+      </w:pPr>
+      <w:rPr>
+        <w:rFonts w:ascii="Courier New" w:hAnsi="Courier New" w:cs="Courier New" w:hint="default"/>
+      </w:rPr>
+    </w:lvl>
+    <w:lvl w:ilvl="8" w:tplc="40090005" w:tentative="1">
+      <w:start w:val="1"/>
+      <w:numFmt w:val="bullet"/>
+      <w:lvlText w:val=""/>
+      <w:lvlJc w:val="left"/>
+      <w:pPr>
+        <w:ind w:left="6480" w:hanging="360"/>
+      </w:pPr>
+      <w:rPr>
+        <w:rFonts w:ascii="Wingdings" w:hAnsi="Wingdings" w:hint="default"/>
+      </w:rPr>
+    </w:lvl>
+  </w:abstractNum>
+  <w:abstractNum w:abstractNumId="13" w15:restartNumberingAfterBreak="0">
     <w:nsid w:val="628E285D"/>
     <w:multiLevelType w:val="multilevel"/>
     <w:tmpl w:val="84F631DE"/>
@@ -4053,7 +5424,7 @@
       </w:rPr>
     </w:lvl>
   </w:abstractNum>
-  <w:abstractNum w:abstractNumId="11" w15:restartNumberingAfterBreak="0">
+  <w:abstractNum w:abstractNumId="14" w15:restartNumberingAfterBreak="0">
     <w:nsid w:val="7F4303A1"/>
     <w:multiLevelType w:val="hybridMultilevel"/>
     <w:tmpl w:val="E2348F86"/>
@@ -4170,7 +5541,7 @@
     <w:abstractNumId w:val="3"/>
   </w:num>
   <w:num w:numId="2" w16cid:durableId="2139257778">
-    <w:abstractNumId w:val="7"/>
+    <w:abstractNumId w:val="9"/>
   </w:num>
   <w:num w:numId="3" w16cid:durableId="503666693">
     <w:abstractNumId w:val="0"/>
@@ -4182,28 +5553,37 @@
     <w:abstractNumId w:val="1"/>
   </w:num>
   <w:num w:numId="6" w16cid:durableId="458573642">
-    <w:abstractNumId w:val="6"/>
+    <w:abstractNumId w:val="8"/>
   </w:num>
   <w:num w:numId="7" w16cid:durableId="1774131846">
     <w:abstractNumId w:val="2"/>
   </w:num>
   <w:num w:numId="8" w16cid:durableId="771705788">
+    <w:abstractNumId w:val="6"/>
+  </w:num>
+  <w:num w:numId="9" w16cid:durableId="1048606806">
+    <w:abstractNumId w:val="13"/>
+  </w:num>
+  <w:num w:numId="10" w16cid:durableId="1683510631">
     <w:abstractNumId w:val="5"/>
   </w:num>
-  <w:num w:numId="9" w16cid:durableId="1048606806">
+  <w:num w:numId="11" w16cid:durableId="1985966025">
     <w:abstractNumId w:val="10"/>
   </w:num>
-  <w:num w:numId="10" w16cid:durableId="1683510631">
-    <w:abstractNumId w:val="4"/>
-  </w:num>
-  <w:num w:numId="11" w16cid:durableId="1985966025">
-    <w:abstractNumId w:val="8"/>
-  </w:num>
   <w:num w:numId="12" w16cid:durableId="1578705567">
-    <w:abstractNumId w:val="9"/>
+    <w:abstractNumId w:val="11"/>
   </w:num>
   <w:num w:numId="13" w16cid:durableId="620963561">
-    <w:abstractNumId w:val="11"/>
+    <w:abstractNumId w:val="14"/>
+  </w:num>
+  <w:num w:numId="14" w16cid:durableId="2101682965">
+    <w:abstractNumId w:val="7"/>
+  </w:num>
+  <w:num w:numId="15" w16cid:durableId="1675956557">
+    <w:abstractNumId w:val="12"/>
+  </w:num>
+  <w:num w:numId="16" w16cid:durableId="1097940128">
+    <w:abstractNumId w:val="4"/>
   </w:num>
 </w:numbering>
 </file>
@@ -4608,7 +5988,7 @@
   <w:style w:type="paragraph" w:default="1" w:styleId="Normal">
     <w:name w:val="Normal"/>
     <w:qFormat/>
-    <w:rsid w:val="00912978"/>
+    <w:rsid w:val="00DE5284"/>
   </w:style>
   <w:style w:type="paragraph" w:styleId="Heading1">
     <w:name w:val="heading 1"/>
@@ -4812,7 +6192,6 @@
   <w:style w:type="character" w:default="1" w:styleId="DefaultParagraphFont">
     <w:name w:val="Default Paragraph Font"/>
     <w:uiPriority w:val="1"/>
-    <w:semiHidden/>
     <w:unhideWhenUsed/>
   </w:style>
   <w:style w:type="table" w:default="1" w:styleId="TableNormal">
@@ -5455,6 +6834,50 @@
     <w:pPr>
       <w:spacing w:after="0" w:line="240" w:lineRule="auto"/>
     </w:pPr>
+  </w:style>
+  <w:style w:type="paragraph" w:styleId="Header">
+    <w:name w:val="header"/>
+    <w:basedOn w:val="Normal"/>
+    <w:link w:val="HeaderChar"/>
+    <w:uiPriority w:val="99"/>
+    <w:unhideWhenUsed/>
+    <w:rsid w:val="00DE5284"/>
+    <w:pPr>
+      <w:tabs>
+        <w:tab w:val="center" w:pos="4513"/>
+        <w:tab w:val="right" w:pos="9026"/>
+      </w:tabs>
+      <w:spacing w:after="0" w:line="240" w:lineRule="auto"/>
+    </w:pPr>
+  </w:style>
+  <w:style w:type="character" w:customStyle="1" w:styleId="HeaderChar">
+    <w:name w:val="Header Char"/>
+    <w:basedOn w:val="DefaultParagraphFont"/>
+    <w:link w:val="Header"/>
+    <w:uiPriority w:val="99"/>
+    <w:rsid w:val="00DE5284"/>
+  </w:style>
+  <w:style w:type="paragraph" w:styleId="Footer">
+    <w:name w:val="footer"/>
+    <w:basedOn w:val="Normal"/>
+    <w:link w:val="FooterChar"/>
+    <w:uiPriority w:val="99"/>
+    <w:unhideWhenUsed/>
+    <w:rsid w:val="00DE5284"/>
+    <w:pPr>
+      <w:tabs>
+        <w:tab w:val="center" w:pos="4513"/>
+        <w:tab w:val="right" w:pos="9026"/>
+      </w:tabs>
+      <w:spacing w:after="0" w:line="240" w:lineRule="auto"/>
+    </w:pPr>
+  </w:style>
+  <w:style w:type="character" w:customStyle="1" w:styleId="FooterChar">
+    <w:name w:val="Footer Char"/>
+    <w:basedOn w:val="DefaultParagraphFont"/>
+    <w:link w:val="Footer"/>
+    <w:uiPriority w:val="99"/>
+    <w:rsid w:val="00DE5284"/>
   </w:style>
 </w:styles>
 </file>
@@ -5775,6 +7198,19 @@
 </file>
 
 <file path=customXml/item1.xml><?xml version="1.0" encoding="utf-8"?>
+<b:Sources xmlns:b="http://schemas.openxmlformats.org/officeDocument/2006/bibliography" xmlns="http://schemas.openxmlformats.org/officeDocument/2006/bibliography" SelectedStyle="\APASixthEditionOfficeOnline.xsl" StyleName="APA" Version="6"/>
+</file>
+
+<file path=customXml/item2.xml><?xml version="1.0" encoding="utf-8"?>
+<?mso-contentType ?>
+<FormTemplates xmlns="http://schemas.microsoft.com/sharepoint/v3/contenttype/forms">
+  <Display>DocumentLibraryForm</Display>
+  <Edit>DocumentLibraryForm</Edit>
+  <New>DocumentLibraryForm</New>
+</FormTemplates>
+</file>
+
+<file path=customXml/item3.xml><?xml version="1.0" encoding="utf-8"?>
 <ct:contentTypeSchema xmlns:ct="http://schemas.microsoft.com/office/2006/metadata/contentType" xmlns:ma="http://schemas.microsoft.com/office/2006/metadata/properties/metaAttributes" ct:_="" ma:_="" ma:contentTypeName="Document" ma:contentTypeID="0x0101002A361625FF487C4CA3EA5191E57B8C6D" ma:contentTypeVersion="7" ma:contentTypeDescription="Create a new document." ma:contentTypeScope="" ma:versionID="0eb70986208f3b9782e223574112875e">
   <xsd:schema xmlns:xsd="http://www.w3.org/2001/XMLSchema" xmlns:xs="http://www.w3.org/2001/XMLSchema" xmlns:p="http://schemas.microsoft.com/office/2006/metadata/properties" xmlns:ns2="caee7eb6-6dd4-45c1-9e8a-babddf390f35" targetNamespace="http://schemas.microsoft.com/office/2006/metadata/properties" ma:root="true" ma:fieldsID="c0a23b2e9e369a39959eaa3f9d93fb8c" ns2:_="">
     <xsd:import namespace="caee7eb6-6dd4-45c1-9e8a-babddf390f35"/>
@@ -5936,26 +7372,29 @@
 </ct:contentTypeSchema>
 </file>
 
-<file path=customXml/item2.xml><?xml version="1.0" encoding="utf-8"?>
+<file path=customXml/item4.xml><?xml version="1.0" encoding="utf-8"?>
 <p:properties xmlns:p="http://schemas.microsoft.com/office/2006/metadata/properties" xmlns:xsi="http://www.w3.org/2001/XMLSchema-instance" xmlns:pc="http://schemas.microsoft.com/office/infopath/2007/PartnerControls">
   <documentManagement/>
 </p:properties>
 </file>
 
-<file path=customXml/item3.xml><?xml version="1.0" encoding="utf-8"?>
-<?mso-contentType ?>
-<FormTemplates xmlns="http://schemas.microsoft.com/sharepoint/v3/contenttype/forms">
-  <Display>DocumentLibraryForm</Display>
-  <Edit>DocumentLibraryForm</Edit>
-  <New>DocumentLibraryForm</New>
-</FormTemplates>
+<file path=customXml/itemProps1.xml><?xml version="1.0" encoding="utf-8"?>
+<ds:datastoreItem xmlns:ds="http://schemas.openxmlformats.org/officeDocument/2006/customXml" ds:itemID="{5AAC773B-6D45-4B55-959C-3E5686415B21}">
+  <ds:schemaRefs>
+    <ds:schemaRef ds:uri="http://schemas.openxmlformats.org/officeDocument/2006/bibliography"/>
+  </ds:schemaRefs>
+</ds:datastoreItem>
 </file>
 
-<file path=customXml/item4.xml><?xml version="1.0" encoding="utf-8"?>
-<b:Sources xmlns:b="http://schemas.openxmlformats.org/officeDocument/2006/bibliography" xmlns="http://schemas.openxmlformats.org/officeDocument/2006/bibliography" SelectedStyle="\APASixthEditionOfficeOnline.xsl" StyleName="APA" Version="6"/>
+<file path=customXml/itemProps2.xml><?xml version="1.0" encoding="utf-8"?>
+<ds:datastoreItem xmlns:ds="http://schemas.openxmlformats.org/officeDocument/2006/customXml" ds:itemID="{3F631790-D3F3-4E18-B711-06B94DCBA81C}">
+  <ds:schemaRefs>
+    <ds:schemaRef ds:uri="http://schemas.microsoft.com/sharepoint/v3/contenttype/forms"/>
+  </ds:schemaRefs>
+</ds:datastoreItem>
 </file>
 
-<file path=customXml/itemProps1.xml><?xml version="1.0" encoding="utf-8"?>
+<file path=customXml/itemProps3.xml><?xml version="1.0" encoding="utf-8"?>
 <ds:datastoreItem xmlns:ds="http://schemas.openxmlformats.org/officeDocument/2006/customXml" ds:itemID="{E3968AD7-1EAE-4527-A6B8-19B4121ADDD4}">
   <ds:schemaRefs>
     <ds:schemaRef ds:uri="http://schemas.microsoft.com/office/2006/metadata/contentType"/>
@@ -5973,27 +7412,11 @@
 </ds:datastoreItem>
 </file>
 
-<file path=customXml/itemProps2.xml><?xml version="1.0" encoding="utf-8"?>
+<file path=customXml/itemProps4.xml><?xml version="1.0" encoding="utf-8"?>
 <ds:datastoreItem xmlns:ds="http://schemas.openxmlformats.org/officeDocument/2006/customXml" ds:itemID="{81546901-06A0-43C6-9CC9-9364E0B77FA2}">
   <ds:schemaRefs>
     <ds:schemaRef ds:uri="http://schemas.microsoft.com/office/2006/metadata/properties"/>
     <ds:schemaRef ds:uri="http://schemas.microsoft.com/office/infopath/2007/PartnerControls"/>
   </ds:schemaRefs>
 </ds:datastoreItem>
-</file>
-
-<file path=customXml/itemProps3.xml><?xml version="1.0" encoding="utf-8"?>
-<ds:datastoreItem xmlns:ds="http://schemas.openxmlformats.org/officeDocument/2006/customXml" ds:itemID="{3F631790-D3F3-4E18-B711-06B94DCBA81C}">
-  <ds:schemaRefs>
-    <ds:schemaRef ds:uri="http://schemas.microsoft.com/sharepoint/v3/contenttype/forms"/>
-  </ds:schemaRefs>
-</ds:datastoreItem>
-</file>
-
-<file path=customXml/itemProps4.xml><?xml version="1.0" encoding="utf-8"?>
-<ds:datastoreItem xmlns:ds="http://schemas.openxmlformats.org/officeDocument/2006/customXml" ds:itemID="{5AAC773B-6D45-4B55-959C-3E5686415B21}">
-  <ds:schemaRefs>
-    <ds:schemaRef ds:uri="http://schemas.openxmlformats.org/officeDocument/2006/bibliography"/>
-  </ds:schemaRefs>
-</ds:datastoreItem>
 </file>
</xml_diff>

<commit_message>
updated the report document
</commit_message>
<xml_diff>
--- a/Evidence/QuickGridSorting.docx
+++ b/Evidence/QuickGridSorting.docx
@@ -663,7 +663,15 @@
           <w:sz w:val="22"/>
           <w:szCs w:val="22"/>
         </w:rPr>
-        <w:t>s</w:t>
+        <w:t xml:space="preserve">sort=Price </w:t>
+      </w:r>
+      <w:r>
+        <w:rPr>
+          <w:rFonts w:ascii="Segoe UI" w:hAnsi="Segoe UI" w:cs="Segoe UI"/>
+          <w:sz w:val="22"/>
+          <w:szCs w:val="22"/>
+        </w:rPr>
+        <w:t xml:space="preserve">selects the column titled </w:t>
       </w:r>
       <w:r>
         <w:rPr>
@@ -672,42 +680,7 @@
           <w:sz w:val="22"/>
           <w:szCs w:val="22"/>
         </w:rPr>
-        <w:t>ort=Price</w:t>
-      </w:r>
-      <w:r>
-        <w:rPr>
-          <w:rFonts w:ascii="Segoe UI" w:hAnsi="Segoe UI" w:cs="Segoe UI"/>
-          <w:color w:val="BF4E14" w:themeColor="accent2" w:themeShade="BF"/>
-          <w:sz w:val="22"/>
-          <w:szCs w:val="22"/>
-        </w:rPr>
-        <w:t xml:space="preserve"> </w:t>
-      </w:r>
-      <w:r>
-        <w:rPr>
-          <w:rFonts w:ascii="Segoe UI" w:hAnsi="Segoe UI" w:cs="Segoe UI"/>
-          <w:sz w:val="22"/>
-          <w:szCs w:val="22"/>
-        </w:rPr>
-        <w:t xml:space="preserve">selects the column titled </w:t>
-      </w:r>
-      <w:r>
-        <w:rPr>
-          <w:rFonts w:ascii="Segoe UI" w:hAnsi="Segoe UI" w:cs="Segoe UI"/>
-          <w:color w:val="BF4E14" w:themeColor="accent2" w:themeShade="BF"/>
-          <w:sz w:val="22"/>
-          <w:szCs w:val="22"/>
-        </w:rPr>
-        <w:t>Pric</w:t>
-      </w:r>
-      <w:r>
-        <w:rPr>
-          <w:rFonts w:ascii="Segoe UI" w:hAnsi="Segoe UI" w:cs="Segoe UI"/>
-          <w:color w:val="BF4E14" w:themeColor="accent2" w:themeShade="BF"/>
-          <w:sz w:val="22"/>
-          <w:szCs w:val="22"/>
-        </w:rPr>
-        <w:t>e</w:t>
+        <w:t>Price</w:t>
       </w:r>
       <w:r>
         <w:rPr>
@@ -763,23 +736,7 @@
           <w:sz w:val="22"/>
           <w:szCs w:val="22"/>
         </w:rPr>
-        <w:t>select</w:t>
-      </w:r>
-      <w:r>
-        <w:rPr>
-          <w:rFonts w:ascii="Segoe UI" w:hAnsi="Segoe UI" w:cs="Segoe UI"/>
-          <w:sz w:val="22"/>
-          <w:szCs w:val="22"/>
-        </w:rPr>
-        <w:t>s</w:t>
-      </w:r>
-      <w:r>
-        <w:rPr>
-          <w:rFonts w:ascii="Segoe UI" w:hAnsi="Segoe UI" w:cs="Segoe UI"/>
-          <w:sz w:val="22"/>
-          <w:szCs w:val="22"/>
-        </w:rPr>
-        <w:t xml:space="preserve"> the ordering.</w:t>
+        <w:t>selects the ordering.</w:t>
       </w:r>
     </w:p>
     <w:p>
@@ -801,23 +758,7 @@
           <w:sz w:val="22"/>
           <w:szCs w:val="22"/>
         </w:rPr>
-        <w:t>The PropertyColumn without an explicit Title infers ItemNumber,</w:t>
-      </w:r>
-      <w:r>
-        <w:rPr>
-          <w:rFonts w:ascii="Segoe UI" w:hAnsi="Segoe UI" w:cs="Segoe UI"/>
-          <w:sz w:val="22"/>
-          <w:szCs w:val="22"/>
-        </w:rPr>
-        <w:t xml:space="preserve"> </w:t>
-      </w:r>
-      <w:r>
-        <w:rPr>
-          <w:rFonts w:ascii="Segoe UI" w:hAnsi="Segoe UI" w:cs="Segoe UI"/>
-          <w:sz w:val="22"/>
-          <w:szCs w:val="22"/>
-        </w:rPr>
-        <w:t xml:space="preserve">which is also used as its </w:t>
+        <w:t xml:space="preserve">The PropertyColumn without an explicit Title infers ItemNumber, which is also used as its </w:t>
       </w:r>
       <w:proofErr w:type="gramStart"/>
       <w:r>
@@ -1199,8 +1140,8 @@
       <w:tblGrid>
         <w:gridCol w:w="720"/>
         <w:gridCol w:w="4950"/>
-        <w:gridCol w:w="1080"/>
-        <w:gridCol w:w="3150"/>
+        <w:gridCol w:w="810"/>
+        <w:gridCol w:w="3420"/>
       </w:tblGrid>
       <w:tr>
         <w:trPr>
@@ -1264,7 +1205,7 @@
         </w:tc>
         <w:tc>
           <w:tcPr>
-            <w:tcW w:w="1080" w:type="dxa"/>
+            <w:tcW w:w="810" w:type="dxa"/>
           </w:tcPr>
           <w:p>
             <w:pPr>
@@ -1288,7 +1229,7 @@
         </w:tc>
         <w:tc>
           <w:tcPr>
-            <w:tcW w:w="3150" w:type="dxa"/>
+            <w:tcW w:w="3420" w:type="dxa"/>
           </w:tcPr>
           <w:p>
             <w:pPr>
@@ -1386,7 +1327,7 @@
         </w:tc>
         <w:tc>
           <w:tcPr>
-            <w:tcW w:w="1080" w:type="dxa"/>
+            <w:tcW w:w="810" w:type="dxa"/>
           </w:tcPr>
           <w:p>
             <w:pPr>
@@ -1408,7 +1349,7 @@
         </w:tc>
         <w:tc>
           <w:tcPr>
-            <w:tcW w:w="3150" w:type="dxa"/>
+            <w:tcW w:w="3420" w:type="dxa"/>
           </w:tcPr>
           <w:p>
             <w:pPr>
@@ -1567,7 +1508,7 @@
         </w:tc>
         <w:tc>
           <w:tcPr>
-            <w:tcW w:w="1080" w:type="dxa"/>
+            <w:tcW w:w="810" w:type="dxa"/>
           </w:tcPr>
           <w:p>
             <w:pPr>
@@ -1589,7 +1530,7 @@
         </w:tc>
         <w:tc>
           <w:tcPr>
-            <w:tcW w:w="3150" w:type="dxa"/>
+            <w:tcW w:w="3420" w:type="dxa"/>
           </w:tcPr>
           <w:p>
             <w:pPr>
@@ -1733,7 +1674,7 @@
         </w:tc>
         <w:tc>
           <w:tcPr>
-            <w:tcW w:w="1080" w:type="dxa"/>
+            <w:tcW w:w="810" w:type="dxa"/>
           </w:tcPr>
           <w:p>
             <w:pPr>
@@ -1755,7 +1696,7 @@
         </w:tc>
         <w:tc>
           <w:tcPr>
-            <w:tcW w:w="3150" w:type="dxa"/>
+            <w:tcW w:w="3420" w:type="dxa"/>
           </w:tcPr>
           <w:p>
             <w:pPr>
@@ -1906,7 +1847,7 @@
         </w:tc>
         <w:tc>
           <w:tcPr>
-            <w:tcW w:w="1080" w:type="dxa"/>
+            <w:tcW w:w="810" w:type="dxa"/>
           </w:tcPr>
           <w:p>
             <w:pPr>
@@ -1928,7 +1869,7 @@
         </w:tc>
         <w:tc>
           <w:tcPr>
-            <w:tcW w:w="3150" w:type="dxa"/>
+            <w:tcW w:w="3420" w:type="dxa"/>
           </w:tcPr>
           <w:p>
             <w:pPr>
@@ -2079,7 +2020,7 @@
         </w:tc>
         <w:tc>
           <w:tcPr>
-            <w:tcW w:w="1080" w:type="dxa"/>
+            <w:tcW w:w="810" w:type="dxa"/>
           </w:tcPr>
           <w:p>
             <w:pPr>
@@ -2101,7 +2042,7 @@
         </w:tc>
         <w:tc>
           <w:tcPr>
-            <w:tcW w:w="3150" w:type="dxa"/>
+            <w:tcW w:w="3420" w:type="dxa"/>
           </w:tcPr>
           <w:p>
             <w:pPr>
@@ -2118,23 +2059,7 @@
                   <w:sz w:val="22"/>
                   <w:szCs w:val="22"/>
                 </w:rPr>
-                <w:t>5_Static.</w:t>
-              </w:r>
-              <w:r>
-                <w:rPr>
-                  <w:rStyle w:val="Hyperlink"/>
-                  <w:sz w:val="22"/>
-                  <w:szCs w:val="22"/>
-                </w:rPr>
-                <w:t>p</w:t>
-              </w:r>
-              <w:r>
-                <w:rPr>
-                  <w:rStyle w:val="Hyperlink"/>
-                  <w:sz w:val="22"/>
-                  <w:szCs w:val="22"/>
-                </w:rPr>
-                <w:t>ng</w:t>
+                <w:t>5_Static.png</w:t>
               </w:r>
             </w:hyperlink>
           </w:p>
@@ -2200,7 +2125,7 @@
         </w:tc>
         <w:tc>
           <w:tcPr>
-            <w:tcW w:w="1080" w:type="dxa"/>
+            <w:tcW w:w="810" w:type="dxa"/>
           </w:tcPr>
           <w:p>
             <w:pPr>
@@ -2222,7 +2147,7 @@
         </w:tc>
         <w:tc>
           <w:tcPr>
-            <w:tcW w:w="3150" w:type="dxa"/>
+            <w:tcW w:w="3420" w:type="dxa"/>
           </w:tcPr>
           <w:p>
             <w:pPr>
@@ -2317,7 +2242,7 @@
         </w:tc>
         <w:tc>
           <w:tcPr>
-            <w:tcW w:w="1080" w:type="dxa"/>
+            <w:tcW w:w="810" w:type="dxa"/>
           </w:tcPr>
           <w:p>
             <w:pPr>
@@ -2339,7 +2264,7 @@
         </w:tc>
         <w:tc>
           <w:tcPr>
-            <w:tcW w:w="3150" w:type="dxa"/>
+            <w:tcW w:w="3420" w:type="dxa"/>
           </w:tcPr>
           <w:p>
             <w:pPr>
@@ -2519,7 +2444,7 @@
         </w:tc>
         <w:tc>
           <w:tcPr>
-            <w:tcW w:w="1080" w:type="dxa"/>
+            <w:tcW w:w="810" w:type="dxa"/>
           </w:tcPr>
           <w:p>
             <w:pPr>
@@ -2541,7 +2466,7 @@
         </w:tc>
         <w:tc>
           <w:tcPr>
-            <w:tcW w:w="3150" w:type="dxa"/>
+            <w:tcW w:w="3420" w:type="dxa"/>
           </w:tcPr>
           <w:p>
             <w:pPr>
@@ -2675,7 +2600,7 @@
         </w:tc>
         <w:tc>
           <w:tcPr>
-            <w:tcW w:w="1080" w:type="dxa"/>
+            <w:tcW w:w="810" w:type="dxa"/>
           </w:tcPr>
           <w:p>
             <w:pPr>
@@ -2698,7 +2623,7 @@
         </w:tc>
         <w:tc>
           <w:tcPr>
-            <w:tcW w:w="3150" w:type="dxa"/>
+            <w:tcW w:w="3420" w:type="dxa"/>
           </w:tcPr>
           <w:p>
             <w:pPr>
@@ -2843,7 +2768,7 @@
         </w:tc>
         <w:tc>
           <w:tcPr>
-            <w:tcW w:w="1080" w:type="dxa"/>
+            <w:tcW w:w="810" w:type="dxa"/>
           </w:tcPr>
           <w:p>
             <w:pPr>
@@ -2865,7 +2790,7 @@
         </w:tc>
         <w:tc>
           <w:tcPr>
-            <w:tcW w:w="3150" w:type="dxa"/>
+            <w:tcW w:w="3420" w:type="dxa"/>
           </w:tcPr>
           <w:p>
             <w:pPr>
@@ -2952,7 +2877,7 @@
         </w:tc>
         <w:tc>
           <w:tcPr>
-            <w:tcW w:w="1080" w:type="dxa"/>
+            <w:tcW w:w="810" w:type="dxa"/>
           </w:tcPr>
           <w:p>
             <w:pPr>
@@ -2974,7 +2899,7 @@
         </w:tc>
         <w:tc>
           <w:tcPr>
-            <w:tcW w:w="3150" w:type="dxa"/>
+            <w:tcW w:w="3420" w:type="dxa"/>
           </w:tcPr>
           <w:p>
             <w:pPr>
@@ -3156,7 +3081,7 @@
         </w:tc>
         <w:tc>
           <w:tcPr>
-            <w:tcW w:w="1080" w:type="dxa"/>
+            <w:tcW w:w="810" w:type="dxa"/>
           </w:tcPr>
           <w:p>
             <w:pPr>
@@ -3178,7 +3103,7 @@
         </w:tc>
         <w:tc>
           <w:tcPr>
-            <w:tcW w:w="3150" w:type="dxa"/>
+            <w:tcW w:w="3420" w:type="dxa"/>
           </w:tcPr>
           <w:p>
             <w:pPr>
@@ -3297,16 +3222,7 @@
                 <w:szCs w:val="22"/>
                 <w:highlight w:val="yellow"/>
               </w:rPr>
-              <w:t>Must Hold</w:t>
-            </w:r>
-            <w:r>
-              <w:rPr>
-                <w:rFonts w:ascii="Segoe UI" w:hAnsi="Segoe UI" w:cs="Segoe UI"/>
-                <w:sz w:val="22"/>
-                <w:szCs w:val="22"/>
-                <w:highlight w:val="yellow"/>
-              </w:rPr>
-              <w:t xml:space="preserve"> Scenario</w:t>
+              <w:t>Must Hold Scenario</w:t>
             </w:r>
             <w:r>
               <w:rPr>
@@ -3556,23 +3472,13 @@
               </w:rPr>
               <w:t xml:space="preserve">Fallback: Price </w:t>
             </w:r>
-            <w:proofErr w:type="gramStart"/>
-            <w:r>
-              <w:rPr>
-                <w:rFonts w:ascii="Segoe UI" w:hAnsi="Segoe UI" w:cs="Segoe UI"/>
-                <w:sz w:val="22"/>
-                <w:szCs w:val="22"/>
-              </w:rPr>
-              <w:t>sort</w:t>
-            </w:r>
-            <w:proofErr w:type="gramEnd"/>
-            <w:r>
-              <w:rPr>
-                <w:rFonts w:ascii="Segoe UI" w:hAnsi="Segoe UI" w:cs="Segoe UI"/>
-                <w:sz w:val="22"/>
-                <w:szCs w:val="22"/>
-              </w:rPr>
-              <w:t xml:space="preserve"> to </w:t>
+            <w:r>
+              <w:rPr>
+                <w:rFonts w:ascii="Segoe UI" w:hAnsi="Segoe UI" w:cs="Segoe UI"/>
+                <w:sz w:val="22"/>
+                <w:szCs w:val="22"/>
+              </w:rPr>
+              <w:t xml:space="preserve">sort to </w:t>
             </w:r>
             <w:r>
               <w:rPr>
@@ -3604,7 +3510,7 @@
         </w:tc>
         <w:tc>
           <w:tcPr>
-            <w:tcW w:w="1080" w:type="dxa"/>
+            <w:tcW w:w="810" w:type="dxa"/>
           </w:tcPr>
           <w:p>
             <w:pPr>
@@ -3626,7 +3532,7 @@
         </w:tc>
         <w:tc>
           <w:tcPr>
-            <w:tcW w:w="3150" w:type="dxa"/>
+            <w:tcW w:w="3420" w:type="dxa"/>
           </w:tcPr>
           <w:p>
             <w:pPr>
@@ -3643,7 +3549,7 @@
                   <w:sz w:val="22"/>
                   <w:szCs w:val="22"/>
                 </w:rPr>
-                <w:t>13_Server_MalformedUrls</w:t>
+                <w:t>13_Server_MalformedUrls.mp4</w:t>
               </w:r>
             </w:hyperlink>
           </w:p>
@@ -3662,7 +3568,7 @@
                   <w:sz w:val="22"/>
                   <w:szCs w:val="22"/>
                 </w:rPr>
-                <w:t>13_Static_MalformedUrls</w:t>
+                <w:t>13_Static_MalformedUrls.mp4</w:t>
               </w:r>
             </w:hyperlink>
           </w:p>
@@ -3681,7 +3587,7 @@
                   <w:sz w:val="22"/>
                   <w:szCs w:val="22"/>
                 </w:rPr>
-                <w:t>13_WASM_MalformedUrls</w:t>
+                <w:t>13_WASM_MalformedUrls.mp4</w:t>
               </w:r>
             </w:hyperlink>
           </w:p>
@@ -6192,6 +6098,7 @@
   <w:style w:type="character" w:default="1" w:styleId="DefaultParagraphFont">
     <w:name w:val="Default Paragraph Font"/>
     <w:uiPriority w:val="1"/>
+    <w:semiHidden/>
     <w:unhideWhenUsed/>
   </w:style>
   <w:style w:type="table" w:default="1" w:styleId="TableNormal">
@@ -7198,19 +7105,12 @@
 </file>
 
 <file path=customXml/item1.xml><?xml version="1.0" encoding="utf-8"?>
-<b:Sources xmlns:b="http://schemas.openxmlformats.org/officeDocument/2006/bibliography" xmlns="http://schemas.openxmlformats.org/officeDocument/2006/bibliography" SelectedStyle="\APASixthEditionOfficeOnline.xsl" StyleName="APA" Version="6"/>
+<p:properties xmlns:p="http://schemas.microsoft.com/office/2006/metadata/properties" xmlns:xsi="http://www.w3.org/2001/XMLSchema-instance" xmlns:pc="http://schemas.microsoft.com/office/infopath/2007/PartnerControls">
+  <documentManagement/>
+</p:properties>
 </file>
 
 <file path=customXml/item2.xml><?xml version="1.0" encoding="utf-8"?>
-<?mso-contentType ?>
-<FormTemplates xmlns="http://schemas.microsoft.com/sharepoint/v3/contenttype/forms">
-  <Display>DocumentLibraryForm</Display>
-  <Edit>DocumentLibraryForm</Edit>
-  <New>DocumentLibraryForm</New>
-</FormTemplates>
-</file>
-
-<file path=customXml/item3.xml><?xml version="1.0" encoding="utf-8"?>
 <ct:contentTypeSchema xmlns:ct="http://schemas.microsoft.com/office/2006/metadata/contentType" xmlns:ma="http://schemas.microsoft.com/office/2006/metadata/properties/metaAttributes" ct:_="" ma:_="" ma:contentTypeName="Document" ma:contentTypeID="0x0101002A361625FF487C4CA3EA5191E57B8C6D" ma:contentTypeVersion="7" ma:contentTypeDescription="Create a new document." ma:contentTypeScope="" ma:versionID="0eb70986208f3b9782e223574112875e">
   <xsd:schema xmlns:xsd="http://www.w3.org/2001/XMLSchema" xmlns:xs="http://www.w3.org/2001/XMLSchema" xmlns:p="http://schemas.microsoft.com/office/2006/metadata/properties" xmlns:ns2="caee7eb6-6dd4-45c1-9e8a-babddf390f35" targetNamespace="http://schemas.microsoft.com/office/2006/metadata/properties" ma:root="true" ma:fieldsID="c0a23b2e9e369a39959eaa3f9d93fb8c" ns2:_="">
     <xsd:import namespace="caee7eb6-6dd4-45c1-9e8a-babddf390f35"/>
@@ -7372,29 +7272,29 @@
 </ct:contentTypeSchema>
 </file>
 
+<file path=customXml/item3.xml><?xml version="1.0" encoding="utf-8"?>
+<b:Sources xmlns:b="http://schemas.openxmlformats.org/officeDocument/2006/bibliography" xmlns="http://schemas.openxmlformats.org/officeDocument/2006/bibliography" SelectedStyle="\APASixthEditionOfficeOnline.xsl" StyleName="APA" Version="6"/>
+</file>
+
 <file path=customXml/item4.xml><?xml version="1.0" encoding="utf-8"?>
-<p:properties xmlns:p="http://schemas.microsoft.com/office/2006/metadata/properties" xmlns:xsi="http://www.w3.org/2001/XMLSchema-instance" xmlns:pc="http://schemas.microsoft.com/office/infopath/2007/PartnerControls">
-  <documentManagement/>
-</p:properties>
+<?mso-contentType ?>
+<FormTemplates xmlns="http://schemas.microsoft.com/sharepoint/v3/contenttype/forms">
+  <Display>DocumentLibraryForm</Display>
+  <Edit>DocumentLibraryForm</Edit>
+  <New>DocumentLibraryForm</New>
+</FormTemplates>
 </file>
 
 <file path=customXml/itemProps1.xml><?xml version="1.0" encoding="utf-8"?>
-<ds:datastoreItem xmlns:ds="http://schemas.openxmlformats.org/officeDocument/2006/customXml" ds:itemID="{5AAC773B-6D45-4B55-959C-3E5686415B21}">
+<ds:datastoreItem xmlns:ds="http://schemas.openxmlformats.org/officeDocument/2006/customXml" ds:itemID="{81546901-06A0-43C6-9CC9-9364E0B77FA2}">
   <ds:schemaRefs>
-    <ds:schemaRef ds:uri="http://schemas.openxmlformats.org/officeDocument/2006/bibliography"/>
+    <ds:schemaRef ds:uri="http://schemas.microsoft.com/office/2006/metadata/properties"/>
+    <ds:schemaRef ds:uri="http://schemas.microsoft.com/office/infopath/2007/PartnerControls"/>
   </ds:schemaRefs>
 </ds:datastoreItem>
 </file>
 
 <file path=customXml/itemProps2.xml><?xml version="1.0" encoding="utf-8"?>
-<ds:datastoreItem xmlns:ds="http://schemas.openxmlformats.org/officeDocument/2006/customXml" ds:itemID="{3F631790-D3F3-4E18-B711-06B94DCBA81C}">
-  <ds:schemaRefs>
-    <ds:schemaRef ds:uri="http://schemas.microsoft.com/sharepoint/v3/contenttype/forms"/>
-  </ds:schemaRefs>
-</ds:datastoreItem>
-</file>
-
-<file path=customXml/itemProps3.xml><?xml version="1.0" encoding="utf-8"?>
 <ds:datastoreItem xmlns:ds="http://schemas.openxmlformats.org/officeDocument/2006/customXml" ds:itemID="{E3968AD7-1EAE-4527-A6B8-19B4121ADDD4}">
   <ds:schemaRefs>
     <ds:schemaRef ds:uri="http://schemas.microsoft.com/office/2006/metadata/contentType"/>
@@ -7412,11 +7312,18 @@
 </ds:datastoreItem>
 </file>
 
+<file path=customXml/itemProps3.xml><?xml version="1.0" encoding="utf-8"?>
+<ds:datastoreItem xmlns:ds="http://schemas.openxmlformats.org/officeDocument/2006/customXml" ds:itemID="{5AAC773B-6D45-4B55-959C-3E5686415B21}">
+  <ds:schemaRefs>
+    <ds:schemaRef ds:uri="http://schemas.openxmlformats.org/officeDocument/2006/bibliography"/>
+  </ds:schemaRefs>
+</ds:datastoreItem>
+</file>
+
 <file path=customXml/itemProps4.xml><?xml version="1.0" encoding="utf-8"?>
-<ds:datastoreItem xmlns:ds="http://schemas.openxmlformats.org/officeDocument/2006/customXml" ds:itemID="{81546901-06A0-43C6-9CC9-9364E0B77FA2}">
+<ds:datastoreItem xmlns:ds="http://schemas.openxmlformats.org/officeDocument/2006/customXml" ds:itemID="{3F631790-D3F3-4E18-B711-06B94DCBA81C}">
   <ds:schemaRefs>
-    <ds:schemaRef ds:uri="http://schemas.microsoft.com/office/2006/metadata/properties"/>
-    <ds:schemaRef ds:uri="http://schemas.microsoft.com/office/infopath/2007/PartnerControls"/>
+    <ds:schemaRef ds:uri="http://schemas.microsoft.com/sharepoint/v3/contenttype/forms"/>
   </ds:schemaRefs>
 </ds:datastoreItem>
 </file>
</xml_diff>